<commit_message>
docs: embed rendered Grafana dashboard in documentation
</commit_message>
<xml_diff>
--- a/DOKUMENTACIJA.docx
+++ b/DOKUMENTACIJA.docx
@@ -5977,43 +5977,58 @@
       </w:tr>
     </w:tbl>
     <w:p/>
-    <w:tbl>
-      <w:tblPr>
-        <w:tblStyle w:val="TableGrid"/>
-        <w:tblW w:type="auto" w:w="0"/>
-        <w:tblLook w:firstColumn="1" w:firstRow="1" w:lastColumn="0" w:lastRow="0" w:noHBand="0" w:noVBand="1" w:val="04A0"/>
-      </w:tblPr>
-      <w:tblGrid>
-        <w:gridCol w:w="8640"/>
-      </w:tblGrid>
-      <w:tr>
-        <w:tc>
-          <w:tcPr>
-            <w:tcW w:type="dxa" w:w="8640"/>
-            <w:shd w:val="clear" w:fill="FFF6E5"/>
-          </w:tcPr>
-          <w:p>
-            <w:r/>
-            <w:r>
-              <w:rPr>
-                <w:b/>
-                <w:sz w:val="19"/>
-              </w:rPr>
-              <w:t>Mesto za sliku: Grafana dashboard sa tri trazene metrike</w:t>
-            </w:r>
-          </w:p>
-          <w:p>
-            <w:r>
-              <w:rPr>
-                <w:sz w:val="18"/>
-              </w:rPr>
-              <w:t>Sacuvati kao docs/images/grafana-dashboard.png i ponovo generisati dokument. Izvor: http://localhost:3000, dashboard CRM System Overview</w:t>
-            </w:r>
-          </w:p>
-        </w:tc>
-      </w:tr>
-    </w:tbl>
-    <w:p/>
+    <w:p>
+      <w:pPr>
+        <w:jc w:val="center"/>
+      </w:pPr>
+      <w:r>
+        <w:drawing>
+          <wp:inline xmlns:a="http://schemas.openxmlformats.org/drawingml/2006/main" xmlns:pic="http://schemas.openxmlformats.org/drawingml/2006/picture">
+            <wp:extent cx="5760720" cy="4416552"/>
+            <wp:docPr id="1" name="Picture 1"/>
+            <wp:cNvGraphicFramePr>
+              <a:graphicFrameLocks noChangeAspect="1"/>
+            </wp:cNvGraphicFramePr>
+            <a:graphic>
+              <a:graphicData uri="http://schemas.openxmlformats.org/drawingml/2006/picture">
+                <pic:pic>
+                  <pic:nvPicPr>
+                    <pic:cNvPr id="0" name="grafana-dashboard.png"/>
+                    <pic:cNvPicPr/>
+                  </pic:nvPicPr>
+                  <pic:blipFill>
+                    <a:blip r:embed="rId9"/>
+                    <a:stretch>
+                      <a:fillRect/>
+                    </a:stretch>
+                  </pic:blipFill>
+                  <pic:spPr>
+                    <a:xfrm>
+                      <a:off x="0" y="0"/>
+                      <a:ext cx="5760720" cy="4416552"/>
+                    </a:xfrm>
+                    <a:prstGeom prst="rect"/>
+                  </pic:spPr>
+                </pic:pic>
+              </a:graphicData>
+            </a:graphic>
+          </wp:inline>
+        </w:drawing>
+      </w:r>
+    </w:p>
+    <w:p>
+      <w:pPr>
+        <w:spacing w:after="200"/>
+      </w:pPr>
+      <w:r>
+        <w:rPr>
+          <w:i/>
+          <w:color w:val="555A64"/>
+          <w:sz w:val="17"/>
+        </w:rPr>
+        <w:t>Grafana dashboard sa tri trazene metrike</w:t>
+      </w:r>
+    </w:p>
     <w:p>
       <w:r>
         <w:br w:type="page"/>

</xml_diff>

<commit_message>
docs: allow optional images alongside textual evidence
</commit_message>
<xml_diff>
--- a/DOKUMENTACIJA.docx
+++ b/DOKUMENTACIJA.docx
@@ -10163,80 +10163,6 @@
         <w:t>docker compose ps</w:t>
       </w:r>
     </w:p>
-    <w:tbl>
-      <w:tblPr>
-        <w:tblStyle w:val="TableGrid"/>
-        <w:tblW w:type="auto" w:w="0"/>
-        <w:tblLook w:firstColumn="1" w:firstRow="1" w:lastColumn="0" w:lastRow="0" w:noHBand="0" w:noVBand="1" w:val="04A0"/>
-      </w:tblPr>
-      <w:tblGrid>
-        <w:gridCol w:w="8640"/>
-      </w:tblGrid>
-      <w:tr>
-        <w:tc>
-          <w:tcPr>
-            <w:tcW w:type="dxa" w:w="8640"/>
-            <w:shd w:val="clear" w:fill="FFF6E5"/>
-          </w:tcPr>
-          <w:p>
-            <w:r/>
-            <w:r>
-              <w:rPr>
-                <w:b/>
-                <w:sz w:val="19"/>
-              </w:rPr>
-              <w:t>Mesto za sliku: Zipkin trace kroz cetiri servisa</w:t>
-            </w:r>
-          </w:p>
-          <w:p>
-            <w:r>
-              <w:rPr>
-                <w:sz w:val="18"/>
-              </w:rPr>
-              <w:t>Sacuvati kao docs/images/zipkin-trace.png i ponovo generisati dokument. Izvor: http://localhost:9411, pretraga po servisu task-service</w:t>
-            </w:r>
-          </w:p>
-        </w:tc>
-      </w:tr>
-    </w:tbl>
-    <w:p/>
-    <w:tbl>
-      <w:tblPr>
-        <w:tblStyle w:val="TableGrid"/>
-        <w:tblW w:type="auto" w:w="0"/>
-        <w:tblLook w:firstColumn="1" w:firstRow="1" w:lastColumn="0" w:lastRow="0" w:noHBand="0" w:noVBand="1" w:val="04A0"/>
-      </w:tblPr>
-      <w:tblGrid>
-        <w:gridCol w:w="8640"/>
-      </w:tblGrid>
-      <w:tr>
-        <w:tc>
-          <w:tcPr>
-            <w:tcW w:type="dxa" w:w="8640"/>
-            <w:shd w:val="clear" w:fill="FFF6E5"/>
-          </w:tcPr>
-          <w:p>
-            <w:r/>
-            <w:r>
-              <w:rPr>
-                <w:b/>
-                <w:sz w:val="19"/>
-              </w:rPr>
-              <w:t>Mesto za sliku: Loki logovi filtrirani po trace ID-u</w:t>
-            </w:r>
-          </w:p>
-          <w:p>
-            <w:r>
-              <w:rPr>
-                <w:sz w:val="18"/>
-              </w:rPr>
-              <w:t>Sacuvati kao docs/images/loki-logovi.png i ponovo generisati dokument. Izvor: http://localhost:3000, Explore nad Loki datasource-om</w:t>
-            </w:r>
-          </w:p>
-        </w:tc>
-      </w:tr>
-    </w:tbl>
-    <w:p/>
     <w:sectPr>
       <w:pgSz w:w="12240" w:h="15840"/>
       <w:pgMar w:top="1440" w:right="1800" w:bottom="1440" w:left="1800" w:header="720" w:footer="720" w:gutter="0"/>

</xml_diff>

<commit_message>
docs: add CI, CD and SonarCloud screenshots
</commit_message>
<xml_diff>
--- a/DOKUMENTACIJA.docx
+++ b/DOKUMENTACIJA.docx
@@ -8688,117 +8688,162 @@
       </w:tr>
     </w:tbl>
     <w:p/>
-    <w:tbl>
-      <w:tblPr>
-        <w:tblStyle w:val="TableGrid"/>
-        <w:tblW w:type="auto" w:w="0"/>
-        <w:tblLook w:firstColumn="1" w:firstRow="1" w:lastColumn="0" w:lastRow="0" w:noHBand="0" w:noVBand="1" w:val="04A0"/>
-      </w:tblPr>
-      <w:tblGrid>
-        <w:gridCol w:w="8640"/>
-      </w:tblGrid>
-      <w:tr>
-        <w:tc>
-          <w:tcPr>
-            <w:tcW w:type="dxa" w:w="8640"/>
-            <w:shd w:val="clear" w:fill="FFF6E5"/>
-          </w:tcPr>
-          <w:p>
-            <w:r/>
-            <w:r>
-              <w:rPr>
-                <w:b/>
-                <w:sz w:val="19"/>
-              </w:rPr>
-              <w:t>Mesto za sliku: Zeleni CI pipeline nad main granom</w:t>
-            </w:r>
-          </w:p>
-          <w:p>
-            <w:r>
-              <w:rPr>
-                <w:sz w:val="18"/>
-              </w:rPr>
-              <w:t>Sacuvati kao docs/images/ci-zeleno.png i ponovo generisati dokument. Izvor: GitHub, kartica Actions, CI Pipeline</w:t>
-            </w:r>
-          </w:p>
-        </w:tc>
-      </w:tr>
-    </w:tbl>
-    <w:p/>
-    <w:tbl>
-      <w:tblPr>
-        <w:tblStyle w:val="TableGrid"/>
-        <w:tblW w:type="auto" w:w="0"/>
-        <w:tblLook w:firstColumn="1" w:firstRow="1" w:lastColumn="0" w:lastRow="0" w:noHBand="0" w:noVBand="1" w:val="04A0"/>
-      </w:tblPr>
-      <w:tblGrid>
-        <w:gridCol w:w="8640"/>
-      </w:tblGrid>
-      <w:tr>
-        <w:tc>
-          <w:tcPr>
-            <w:tcW w:type="dxa" w:w="8640"/>
-            <w:shd w:val="clear" w:fill="FFF6E5"/>
-          </w:tcPr>
-          <w:p>
-            <w:r/>
-            <w:r>
-              <w:rPr>
-                <w:b/>
-                <w:sz w:val="19"/>
-              </w:rPr>
-              <w:t>Mesto za sliku: Zeleni CD pipeline sa post-deploy proverom</w:t>
-            </w:r>
-          </w:p>
-          <w:p>
-            <w:r>
-              <w:rPr>
-                <w:sz w:val="18"/>
-              </w:rPr>
-              <w:t>Sacuvati kao docs/images/cd-zeleno.png i ponovo generisati dokument. Izvor: GitHub, kartica Actions, CD Pipeline</w:t>
-            </w:r>
-          </w:p>
-        </w:tc>
-      </w:tr>
-    </w:tbl>
-    <w:p/>
-    <w:tbl>
-      <w:tblPr>
-        <w:tblStyle w:val="TableGrid"/>
-        <w:tblW w:type="auto" w:w="0"/>
-        <w:tblLook w:firstColumn="1" w:firstRow="1" w:lastColumn="0" w:lastRow="0" w:noHBand="0" w:noVBand="1" w:val="04A0"/>
-      </w:tblPr>
-      <w:tblGrid>
-        <w:gridCol w:w="8640"/>
-      </w:tblGrid>
-      <w:tr>
-        <w:tc>
-          <w:tcPr>
-            <w:tcW w:type="dxa" w:w="8640"/>
-            <w:shd w:val="clear" w:fill="FFF6E5"/>
-          </w:tcPr>
-          <w:p>
-            <w:r/>
-            <w:r>
-              <w:rPr>
-                <w:b/>
-                <w:sz w:val="19"/>
-              </w:rPr>
-              <w:t>Mesto za sliku: SonarCloud rezultat sa pokrivenoscu koda</w:t>
-            </w:r>
-          </w:p>
-          <w:p>
-            <w:r>
-              <w:rPr>
-                <w:sz w:val="18"/>
-              </w:rPr>
-              <w:t>Sacuvati kao docs/images/sonarcloud.png i ponovo generisati dokument. Izvor: SonarCloud, projekat LukaC011_devOps</w:t>
-            </w:r>
-          </w:p>
-        </w:tc>
-      </w:tr>
-    </w:tbl>
-    <w:p/>
+    <w:p>
+      <w:pPr>
+        <w:jc w:val="center"/>
+      </w:pPr>
+      <w:r>
+        <w:drawing>
+          <wp:inline xmlns:a="http://schemas.openxmlformats.org/drawingml/2006/main" xmlns:pic="http://schemas.openxmlformats.org/drawingml/2006/picture">
+            <wp:extent cx="5760720" cy="2295287"/>
+            <wp:docPr id="2" name="Picture 2"/>
+            <wp:cNvGraphicFramePr>
+              <a:graphicFrameLocks noChangeAspect="1"/>
+            </wp:cNvGraphicFramePr>
+            <a:graphic>
+              <a:graphicData uri="http://schemas.openxmlformats.org/drawingml/2006/picture">
+                <pic:pic>
+                  <pic:nvPicPr>
+                    <pic:cNvPr id="0" name="ci-zeleno.png"/>
+                    <pic:cNvPicPr/>
+                  </pic:nvPicPr>
+                  <pic:blipFill>
+                    <a:blip r:embed="rId10"/>
+                    <a:stretch>
+                      <a:fillRect/>
+                    </a:stretch>
+                  </pic:blipFill>
+                  <pic:spPr>
+                    <a:xfrm>
+                      <a:off x="0" y="0"/>
+                      <a:ext cx="5760720" cy="2295287"/>
+                    </a:xfrm>
+                    <a:prstGeom prst="rect"/>
+                  </pic:spPr>
+                </pic:pic>
+              </a:graphicData>
+            </a:graphic>
+          </wp:inline>
+        </w:drawing>
+      </w:r>
+    </w:p>
+    <w:p>
+      <w:pPr>
+        <w:spacing w:after="200"/>
+      </w:pPr>
+      <w:r>
+        <w:rPr>
+          <w:i/>
+          <w:color w:val="555A64"/>
+          <w:sz w:val="17"/>
+        </w:rPr>
+        <w:t>Zeleni CI pipeline nad main granom</w:t>
+      </w:r>
+    </w:p>
+    <w:p>
+      <w:pPr>
+        <w:jc w:val="center"/>
+      </w:pPr>
+      <w:r>
+        <w:drawing>
+          <wp:inline xmlns:a="http://schemas.openxmlformats.org/drawingml/2006/main" xmlns:pic="http://schemas.openxmlformats.org/drawingml/2006/picture">
+            <wp:extent cx="5760720" cy="1914609"/>
+            <wp:docPr id="3" name="Picture 3"/>
+            <wp:cNvGraphicFramePr>
+              <a:graphicFrameLocks noChangeAspect="1"/>
+            </wp:cNvGraphicFramePr>
+            <a:graphic>
+              <a:graphicData uri="http://schemas.openxmlformats.org/drawingml/2006/picture">
+                <pic:pic>
+                  <pic:nvPicPr>
+                    <pic:cNvPr id="0" name="cd-zeleno.png"/>
+                    <pic:cNvPicPr/>
+                  </pic:nvPicPr>
+                  <pic:blipFill>
+                    <a:blip r:embed="rId11"/>
+                    <a:stretch>
+                      <a:fillRect/>
+                    </a:stretch>
+                  </pic:blipFill>
+                  <pic:spPr>
+                    <a:xfrm>
+                      <a:off x="0" y="0"/>
+                      <a:ext cx="5760720" cy="1914609"/>
+                    </a:xfrm>
+                    <a:prstGeom prst="rect"/>
+                  </pic:spPr>
+                </pic:pic>
+              </a:graphicData>
+            </a:graphic>
+          </wp:inline>
+        </w:drawing>
+      </w:r>
+    </w:p>
+    <w:p>
+      <w:pPr>
+        <w:spacing w:after="200"/>
+      </w:pPr>
+      <w:r>
+        <w:rPr>
+          <w:i/>
+          <w:color w:val="555A64"/>
+          <w:sz w:val="17"/>
+        </w:rPr>
+        <w:t>Zeleni CD pipeline sa post-deploy proverom</w:t>
+      </w:r>
+    </w:p>
+    <w:p>
+      <w:pPr>
+        <w:jc w:val="center"/>
+      </w:pPr>
+      <w:r>
+        <w:drawing>
+          <wp:inline xmlns:a="http://schemas.openxmlformats.org/drawingml/2006/main" xmlns:pic="http://schemas.openxmlformats.org/drawingml/2006/picture">
+            <wp:extent cx="5760720" cy="2480935"/>
+            <wp:docPr id="4" name="Picture 4"/>
+            <wp:cNvGraphicFramePr>
+              <a:graphicFrameLocks noChangeAspect="1"/>
+            </wp:cNvGraphicFramePr>
+            <a:graphic>
+              <a:graphicData uri="http://schemas.openxmlformats.org/drawingml/2006/picture">
+                <pic:pic>
+                  <pic:nvPicPr>
+                    <pic:cNvPr id="0" name="sonarcloud.png"/>
+                    <pic:cNvPicPr/>
+                  </pic:nvPicPr>
+                  <pic:blipFill>
+                    <a:blip r:embed="rId12"/>
+                    <a:stretch>
+                      <a:fillRect/>
+                    </a:stretch>
+                  </pic:blipFill>
+                  <pic:spPr>
+                    <a:xfrm>
+                      <a:off x="0" y="0"/>
+                      <a:ext cx="5760720" cy="2480935"/>
+                    </a:xfrm>
+                    <a:prstGeom prst="rect"/>
+                  </pic:spPr>
+                </pic:pic>
+              </a:graphicData>
+            </a:graphic>
+          </wp:inline>
+        </w:drawing>
+      </w:r>
+    </w:p>
+    <w:p>
+      <w:pPr>
+        <w:spacing w:after="200"/>
+      </w:pPr>
+      <w:r>
+        <w:rPr>
+          <w:i/>
+          <w:color w:val="555A64"/>
+          <w:sz w:val="17"/>
+        </w:rPr>
+        <w:t>SonarCloud rezultat sa pokrivenoscu koda</w:t>
+      </w:r>
+    </w:p>
     <w:p>
       <w:r>
         <w:br w:type="page"/>

</xml_diff>

<commit_message>
docs: render code snippets as syntax highlighted images
</commit_message>
<xml_diff>
--- a/DOKUMENTACIJA.docx
+++ b/DOKUMENTACIJA.docx
@@ -564,74 +564,45 @@
         <w:t>. Nijedan servis ne cita tudje tabele, komunikacija ide iskljucivo kroz REST ili poruke.</w:t>
       </w:r>
     </w:p>
-    <w:tbl>
-      <w:tblPr>
-        <w:tblStyle w:val="TableGrid"/>
-        <w:tblW w:type="auto" w:w="0"/>
+    <w:p>
+      <w:pPr>
         <w:jc w:val="left"/>
-        <w:tblLook w:firstColumn="1" w:firstRow="1" w:lastColumn="0" w:lastRow="0" w:noHBand="0" w:noVBand="1" w:val="04A0"/>
-      </w:tblPr>
-      <w:tblGrid>
-        <w:gridCol w:w="8640"/>
-      </w:tblGrid>
-      <w:tr>
-        <w:tc>
-          <w:tcPr>
-            <w:tcW w:type="dxa" w:w="8640"/>
-            <w:shd w:val="clear" w:fill="F2F3F5"/>
-          </w:tcPr>
-          <w:p>
-            <w:pPr>
-              <w:spacing w:before="0" w:after="0"/>
-            </w:pPr>
-            <w:r/>
-            <w:r>
-              <w:rPr>
-                <w:rFonts w:ascii="Consolas" w:hAnsi="Consolas" w:eastAsia="Consolas"/>
-                <w:sz w:val="17"/>
-              </w:rPr>
-              <w:t>CREATE DATABASE employee_db;</w:t>
-            </w:r>
-          </w:p>
-          <w:p>
-            <w:pPr>
-              <w:spacing w:before="0" w:after="0"/>
-            </w:pPr>
-            <w:r>
-              <w:rPr>
-                <w:rFonts w:ascii="Consolas" w:hAnsi="Consolas" w:eastAsia="Consolas"/>
-                <w:sz w:val="17"/>
-              </w:rPr>
-              <w:t>CREATE DATABASE client_db;</w:t>
-            </w:r>
-          </w:p>
-          <w:p>
-            <w:pPr>
-              <w:spacing w:before="0" w:after="0"/>
-            </w:pPr>
-            <w:r>
-              <w:rPr>
-                <w:rFonts w:ascii="Consolas" w:hAnsi="Consolas" w:eastAsia="Consolas"/>
-                <w:sz w:val="17"/>
-              </w:rPr>
-              <w:t>CREATE DATABASE task_db;</w:t>
-            </w:r>
-          </w:p>
-          <w:p>
-            <w:pPr>
-              <w:spacing w:before="0" w:after="0"/>
-            </w:pPr>
-            <w:r>
-              <w:rPr>
-                <w:rFonts w:ascii="Consolas" w:hAnsi="Consolas" w:eastAsia="Consolas"/>
-                <w:sz w:val="17"/>
-              </w:rPr>
-              <w:t>CREATE DATABASE notification_db;</w:t>
-            </w:r>
-          </w:p>
-        </w:tc>
-      </w:tr>
-    </w:tbl>
+      </w:pPr>
+      <w:r>
+        <w:drawing>
+          <wp:inline xmlns:a="http://schemas.openxmlformats.org/drawingml/2006/main" xmlns:pic="http://schemas.openxmlformats.org/drawingml/2006/picture">
+            <wp:extent cx="3621024" cy="1054667"/>
+            <wp:docPr id="1" name="Picture 1"/>
+            <wp:cNvGraphicFramePr>
+              <a:graphicFrameLocks noChangeAspect="1"/>
+            </wp:cNvGraphicFramePr>
+            <a:graphic>
+              <a:graphicData uri="http://schemas.openxmlformats.org/drawingml/2006/picture">
+                <pic:pic>
+                  <pic:nvPicPr>
+                    <pic:cNvPr id="0" name="snippet_01.png"/>
+                    <pic:cNvPicPr/>
+                  </pic:nvPicPr>
+                  <pic:blipFill>
+                    <a:blip r:embed="rId9"/>
+                    <a:stretch>
+                      <a:fillRect/>
+                    </a:stretch>
+                  </pic:blipFill>
+                  <pic:spPr>
+                    <a:xfrm>
+                      <a:off x="0" y="0"/>
+                      <a:ext cx="3621024" cy="1054667"/>
+                    </a:xfrm>
+                    <a:prstGeom prst="rect"/>
+                  </pic:spPr>
+                </pic:pic>
+              </a:graphicData>
+            </a:graphic>
+          </wp:inline>
+        </w:drawing>
+      </w:r>
+    </w:p>
     <w:p/>
     <w:p>
       <w:pPr>
@@ -1652,410 +1623,45 @@
         <w:t>Rute gateway-a su konfigurisane deklarativno:</w:t>
       </w:r>
     </w:p>
-    <w:tbl>
-      <w:tblPr>
-        <w:tblStyle w:val="TableGrid"/>
-        <w:tblW w:type="auto" w:w="0"/>
+    <w:p>
+      <w:pPr>
         <w:jc w:val="left"/>
-        <w:tblLook w:firstColumn="1" w:firstRow="1" w:lastColumn="0" w:lastRow="0" w:noHBand="0" w:noVBand="1" w:val="04A0"/>
-      </w:tblPr>
-      <w:tblGrid>
-        <w:gridCol w:w="8640"/>
-      </w:tblGrid>
-      <w:tr>
-        <w:tc>
-          <w:tcPr>
-            <w:tcW w:type="dxa" w:w="8640"/>
-            <w:shd w:val="clear" w:fill="F2F3F5"/>
-          </w:tcPr>
-          <w:p>
-            <w:pPr>
-              <w:spacing w:before="0" w:after="0"/>
-            </w:pPr>
-            <w:r/>
-            <w:r>
-              <w:rPr>
-                <w:rFonts w:ascii="Consolas" w:hAnsi="Consolas" w:eastAsia="Consolas"/>
-                <w:sz w:val="17"/>
-              </w:rPr>
-              <w:t>spring:</w:t>
-            </w:r>
-          </w:p>
-          <w:p>
-            <w:pPr>
-              <w:spacing w:before="0" w:after="0"/>
-            </w:pPr>
-            <w:r>
-              <w:rPr>
-                <w:rFonts w:ascii="Consolas" w:hAnsi="Consolas" w:eastAsia="Consolas"/>
-                <w:sz w:val="17"/>
-              </w:rPr>
-              <w:t xml:space="preserve">  application:</w:t>
-            </w:r>
-          </w:p>
-          <w:p>
-            <w:pPr>
-              <w:spacing w:before="0" w:after="0"/>
-            </w:pPr>
-            <w:r>
-              <w:rPr>
-                <w:rFonts w:ascii="Consolas" w:hAnsi="Consolas" w:eastAsia="Consolas"/>
-                <w:sz w:val="17"/>
-              </w:rPr>
-              <w:t xml:space="preserve">    name: api-gateway</w:t>
-            </w:r>
-          </w:p>
-          <w:p>
-            <w:pPr>
-              <w:spacing w:before="0" w:after="0"/>
-            </w:pPr>
-            <w:r>
-              <w:rPr>
-                <w:rFonts w:ascii="Consolas" w:hAnsi="Consolas" w:eastAsia="Consolas"/>
-                <w:sz w:val="17"/>
-              </w:rPr>
-              <w:t xml:space="preserve">  cloud:</w:t>
-            </w:r>
-          </w:p>
-          <w:p>
-            <w:pPr>
-              <w:spacing w:before="0" w:after="0"/>
-            </w:pPr>
-            <w:r>
-              <w:rPr>
-                <w:rFonts w:ascii="Consolas" w:hAnsi="Consolas" w:eastAsia="Consolas"/>
-                <w:sz w:val="17"/>
-              </w:rPr>
-              <w:t xml:space="preserve">    gateway:</w:t>
-            </w:r>
-          </w:p>
-          <w:p>
-            <w:pPr>
-              <w:spacing w:before="0" w:after="0"/>
-            </w:pPr>
-            <w:r>
-              <w:rPr>
-                <w:rFonts w:ascii="Consolas" w:hAnsi="Consolas" w:eastAsia="Consolas"/>
-                <w:sz w:val="17"/>
-              </w:rPr>
-              <w:t xml:space="preserve">      server:</w:t>
-            </w:r>
-          </w:p>
-          <w:p>
-            <w:pPr>
-              <w:spacing w:before="0" w:after="0"/>
-            </w:pPr>
-            <w:r>
-              <w:rPr>
-                <w:rFonts w:ascii="Consolas" w:hAnsi="Consolas" w:eastAsia="Consolas"/>
-                <w:sz w:val="17"/>
-              </w:rPr>
-              <w:t xml:space="preserve">        webmvc:</w:t>
-            </w:r>
-          </w:p>
-          <w:p>
-            <w:pPr>
-              <w:spacing w:before="0" w:after="0"/>
-            </w:pPr>
-            <w:r>
-              <w:rPr>
-                <w:rFonts w:ascii="Consolas" w:hAnsi="Consolas" w:eastAsia="Consolas"/>
-                <w:sz w:val="17"/>
-              </w:rPr>
-              <w:t xml:space="preserve">          routes:</w:t>
-            </w:r>
-          </w:p>
-          <w:p>
-            <w:pPr>
-              <w:spacing w:before="0" w:after="0"/>
-            </w:pPr>
-            <w:r>
-              <w:rPr>
-                <w:rFonts w:ascii="Consolas" w:hAnsi="Consolas" w:eastAsia="Consolas"/>
-                <w:sz w:val="17"/>
-              </w:rPr>
-              <w:t xml:space="preserve">            - id: employee-service</w:t>
-            </w:r>
-          </w:p>
-          <w:p>
-            <w:pPr>
-              <w:spacing w:before="0" w:after="0"/>
-            </w:pPr>
-            <w:r>
-              <w:rPr>
-                <w:rFonts w:ascii="Consolas" w:hAnsi="Consolas" w:eastAsia="Consolas"/>
-                <w:sz w:val="17"/>
-              </w:rPr>
-              <w:t xml:space="preserve">              uri: ${EMPLOYEE_SERVICE_URL:http://localhost:8081}</w:t>
-            </w:r>
-          </w:p>
-          <w:p>
-            <w:pPr>
-              <w:spacing w:before="0" w:after="0"/>
-            </w:pPr>
-            <w:r>
-              <w:rPr>
-                <w:rFonts w:ascii="Consolas" w:hAnsi="Consolas" w:eastAsia="Consolas"/>
-                <w:sz w:val="17"/>
-              </w:rPr>
-              <w:t xml:space="preserve">              predicates:</w:t>
-            </w:r>
-          </w:p>
-          <w:p>
-            <w:pPr>
-              <w:spacing w:before="0" w:after="0"/>
-            </w:pPr>
-            <w:r>
-              <w:rPr>
-                <w:rFonts w:ascii="Consolas" w:hAnsi="Consolas" w:eastAsia="Consolas"/>
-                <w:sz w:val="17"/>
-              </w:rPr>
-              <w:t xml:space="preserve">                - Path=/api/employees/**</w:t>
-            </w:r>
-          </w:p>
-          <w:p>
-            <w:pPr>
-              <w:spacing w:before="0" w:after="0"/>
-            </w:pPr>
-            <w:r>
-              <w:rPr>
-                <w:rFonts w:ascii="Consolas" w:hAnsi="Consolas" w:eastAsia="Consolas"/>
-                <w:sz w:val="17"/>
-              </w:rPr>
-              <w:t xml:space="preserve">              filters:</w:t>
-            </w:r>
-          </w:p>
-          <w:p>
-            <w:pPr>
-              <w:spacing w:before="0" w:after="0"/>
-            </w:pPr>
-            <w:r>
-              <w:rPr>
-                <w:rFonts w:ascii="Consolas" w:hAnsi="Consolas" w:eastAsia="Consolas"/>
-                <w:sz w:val="17"/>
-              </w:rPr>
-              <w:t xml:space="preserve">                - StripPrefix=1</w:t>
-            </w:r>
-          </w:p>
-          <w:p>
-            <w:pPr>
-              <w:spacing w:before="0" w:after="0"/>
-            </w:pPr>
-            <w:r>
-              <w:rPr>
-                <w:rFonts w:ascii="Consolas" w:hAnsi="Consolas" w:eastAsia="Consolas"/>
-                <w:sz w:val="17"/>
-              </w:rPr>
-              <w:t xml:space="preserve">            - id: client-service</w:t>
-            </w:r>
-          </w:p>
-          <w:p>
-            <w:pPr>
-              <w:spacing w:before="0" w:after="0"/>
-            </w:pPr>
-            <w:r>
-              <w:rPr>
-                <w:rFonts w:ascii="Consolas" w:hAnsi="Consolas" w:eastAsia="Consolas"/>
-                <w:sz w:val="17"/>
-              </w:rPr>
-              <w:t xml:space="preserve">              uri: ${CLIENT_SERVICE_URL:http://localhost:8082}</w:t>
-            </w:r>
-          </w:p>
-          <w:p>
-            <w:pPr>
-              <w:spacing w:before="0" w:after="0"/>
-            </w:pPr>
-            <w:r>
-              <w:rPr>
-                <w:rFonts w:ascii="Consolas" w:hAnsi="Consolas" w:eastAsia="Consolas"/>
-                <w:sz w:val="17"/>
-              </w:rPr>
-              <w:t xml:space="preserve">              predicates:</w:t>
-            </w:r>
-          </w:p>
-          <w:p>
-            <w:pPr>
-              <w:spacing w:before="0" w:after="0"/>
-            </w:pPr>
-            <w:r>
-              <w:rPr>
-                <w:rFonts w:ascii="Consolas" w:hAnsi="Consolas" w:eastAsia="Consolas"/>
-                <w:sz w:val="17"/>
-              </w:rPr>
-              <w:t xml:space="preserve">                - Path=/api/clients/**</w:t>
-            </w:r>
-          </w:p>
-          <w:p>
-            <w:pPr>
-              <w:spacing w:before="0" w:after="0"/>
-            </w:pPr>
-            <w:r>
-              <w:rPr>
-                <w:rFonts w:ascii="Consolas" w:hAnsi="Consolas" w:eastAsia="Consolas"/>
-                <w:sz w:val="17"/>
-              </w:rPr>
-              <w:t xml:space="preserve">              filters:</w:t>
-            </w:r>
-          </w:p>
-          <w:p>
-            <w:pPr>
-              <w:spacing w:before="0" w:after="0"/>
-            </w:pPr>
-            <w:r>
-              <w:rPr>
-                <w:rFonts w:ascii="Consolas" w:hAnsi="Consolas" w:eastAsia="Consolas"/>
-                <w:sz w:val="17"/>
-              </w:rPr>
-              <w:t xml:space="preserve">                - StripPrefix=1</w:t>
-            </w:r>
-          </w:p>
-          <w:p>
-            <w:pPr>
-              <w:spacing w:before="0" w:after="0"/>
-            </w:pPr>
-            <w:r>
-              <w:rPr>
-                <w:rFonts w:ascii="Consolas" w:hAnsi="Consolas" w:eastAsia="Consolas"/>
-                <w:sz w:val="17"/>
-              </w:rPr>
-              <w:t xml:space="preserve">            - id: task-service</w:t>
-            </w:r>
-          </w:p>
-          <w:p>
-            <w:pPr>
-              <w:spacing w:before="0" w:after="0"/>
-            </w:pPr>
-            <w:r>
-              <w:rPr>
-                <w:rFonts w:ascii="Consolas" w:hAnsi="Consolas" w:eastAsia="Consolas"/>
-                <w:sz w:val="17"/>
-              </w:rPr>
-              <w:t xml:space="preserve">              uri: ${TASK_SERVICE_URL:http://localhost:8083}</w:t>
-            </w:r>
-          </w:p>
-          <w:p>
-            <w:pPr>
-              <w:spacing w:before="0" w:after="0"/>
-            </w:pPr>
-            <w:r>
-              <w:rPr>
-                <w:rFonts w:ascii="Consolas" w:hAnsi="Consolas" w:eastAsia="Consolas"/>
-                <w:sz w:val="17"/>
-              </w:rPr>
-              <w:t xml:space="preserve">              predicates:</w:t>
-            </w:r>
-          </w:p>
-          <w:p>
-            <w:pPr>
-              <w:spacing w:before="0" w:after="0"/>
-            </w:pPr>
-            <w:r>
-              <w:rPr>
-                <w:rFonts w:ascii="Consolas" w:hAnsi="Consolas" w:eastAsia="Consolas"/>
-                <w:sz w:val="17"/>
-              </w:rPr>
-              <w:t xml:space="preserve">                - Path=/api/tasks/**</w:t>
-            </w:r>
-          </w:p>
-          <w:p>
-            <w:pPr>
-              <w:spacing w:before="0" w:after="0"/>
-            </w:pPr>
-            <w:r>
-              <w:rPr>
-                <w:rFonts w:ascii="Consolas" w:hAnsi="Consolas" w:eastAsia="Consolas"/>
-                <w:sz w:val="17"/>
-              </w:rPr>
-              <w:t xml:space="preserve">              filters:</w:t>
-            </w:r>
-          </w:p>
-          <w:p>
-            <w:pPr>
-              <w:spacing w:before="0" w:after="0"/>
-            </w:pPr>
-            <w:r>
-              <w:rPr>
-                <w:rFonts w:ascii="Consolas" w:hAnsi="Consolas" w:eastAsia="Consolas"/>
-                <w:sz w:val="17"/>
-              </w:rPr>
-              <w:t xml:space="preserve">                - StripPrefix=1</w:t>
-            </w:r>
-          </w:p>
-          <w:p>
-            <w:pPr>
-              <w:spacing w:before="0" w:after="0"/>
-            </w:pPr>
-            <w:r>
-              <w:rPr>
-                <w:rFonts w:ascii="Consolas" w:hAnsi="Consolas" w:eastAsia="Consolas"/>
-                <w:sz w:val="17"/>
-              </w:rPr>
-              <w:t xml:space="preserve">            - id: notification-service</w:t>
-            </w:r>
-          </w:p>
-          <w:p>
-            <w:pPr>
-              <w:spacing w:before="0" w:after="0"/>
-            </w:pPr>
-            <w:r>
-              <w:rPr>
-                <w:rFonts w:ascii="Consolas" w:hAnsi="Consolas" w:eastAsia="Consolas"/>
-                <w:sz w:val="17"/>
-              </w:rPr>
-              <w:t xml:space="preserve">              uri: ${NOTIFICATION_SERVICE_URL:http://localhost:8084}</w:t>
-            </w:r>
-          </w:p>
-          <w:p>
-            <w:pPr>
-              <w:spacing w:before="0" w:after="0"/>
-            </w:pPr>
-            <w:r>
-              <w:rPr>
-                <w:rFonts w:ascii="Consolas" w:hAnsi="Consolas" w:eastAsia="Consolas"/>
-                <w:sz w:val="17"/>
-              </w:rPr>
-              <w:t xml:space="preserve">              predicates:</w:t>
-            </w:r>
-          </w:p>
-          <w:p>
-            <w:pPr>
-              <w:spacing w:before="0" w:after="0"/>
-            </w:pPr>
-            <w:r>
-              <w:rPr>
-                <w:rFonts w:ascii="Consolas" w:hAnsi="Consolas" w:eastAsia="Consolas"/>
-                <w:sz w:val="17"/>
-              </w:rPr>
-              <w:t xml:space="preserve">                - Path=/api/notifications/**</w:t>
-            </w:r>
-          </w:p>
-          <w:p>
-            <w:pPr>
-              <w:spacing w:before="0" w:after="0"/>
-            </w:pPr>
-            <w:r>
-              <w:rPr>
-                <w:rFonts w:ascii="Consolas" w:hAnsi="Consolas" w:eastAsia="Consolas"/>
-                <w:sz w:val="17"/>
-              </w:rPr>
-              <w:t xml:space="preserve">              filters:</w:t>
-            </w:r>
-          </w:p>
-          <w:p>
-            <w:pPr>
-              <w:spacing w:before="0" w:after="0"/>
-            </w:pPr>
-            <w:r>
-              <w:rPr>
-                <w:rFonts w:ascii="Consolas" w:hAnsi="Consolas" w:eastAsia="Consolas"/>
-                <w:sz w:val="17"/>
-              </w:rPr>
-              <w:t xml:space="preserve">                - StripPrefix=1</w:t>
-            </w:r>
-          </w:p>
-        </w:tc>
-      </w:tr>
-    </w:tbl>
+      </w:pPr>
+      <w:r>
+        <w:drawing>
+          <wp:inline xmlns:a="http://schemas.openxmlformats.org/drawingml/2006/main" xmlns:pic="http://schemas.openxmlformats.org/drawingml/2006/picture">
+            <wp:extent cx="5852160" cy="5297453"/>
+            <wp:docPr id="2" name="Picture 2"/>
+            <wp:cNvGraphicFramePr>
+              <a:graphicFrameLocks noChangeAspect="1"/>
+            </wp:cNvGraphicFramePr>
+            <a:graphic>
+              <a:graphicData uri="http://schemas.openxmlformats.org/drawingml/2006/picture">
+                <pic:pic>
+                  <pic:nvPicPr>
+                    <pic:cNvPr id="0" name="snippet_02.png"/>
+                    <pic:cNvPicPr/>
+                  </pic:nvPicPr>
+                  <pic:blipFill>
+                    <a:blip r:embed="rId10"/>
+                    <a:stretch>
+                      <a:fillRect/>
+                    </a:stretch>
+                  </pic:blipFill>
+                  <pic:spPr>
+                    <a:xfrm>
+                      <a:off x="0" y="0"/>
+                      <a:ext cx="5852160" cy="5297453"/>
+                    </a:xfrm>
+                    <a:prstGeom prst="rect"/>
+                  </pic:spPr>
+                </pic:pic>
+              </a:graphicData>
+            </a:graphic>
+          </wp:inline>
+        </w:drawing>
+      </w:r>
+    </w:p>
     <w:p/>
     <w:p>
       <w:pPr>
@@ -2434,290 +2040,45 @@
         <w:t>Provera zaposlenog pre kreiranja zadatka, sinhrono preko REST-a:</w:t>
       </w:r>
     </w:p>
-    <w:tbl>
-      <w:tblPr>
-        <w:tblStyle w:val="TableGrid"/>
-        <w:tblW w:type="auto" w:w="0"/>
+    <w:p>
+      <w:pPr>
         <w:jc w:val="left"/>
-        <w:tblLook w:firstColumn="1" w:firstRow="1" w:lastColumn="0" w:lastRow="0" w:noHBand="0" w:noVBand="1" w:val="04A0"/>
-      </w:tblPr>
-      <w:tblGrid>
-        <w:gridCol w:w="8640"/>
-      </w:tblGrid>
-      <w:tr>
-        <w:tc>
-          <w:tcPr>
-            <w:tcW w:type="dxa" w:w="8640"/>
-            <w:shd w:val="clear" w:fill="F2F3F5"/>
-          </w:tcPr>
-          <w:p>
-            <w:pPr>
-              <w:spacing w:before="0" w:after="0"/>
-            </w:pPr>
-            <w:r/>
-            <w:r>
-              <w:rPr>
-                <w:rFonts w:ascii="Consolas" w:hAnsi="Consolas" w:eastAsia="Consolas"/>
-                <w:sz w:val="17"/>
-              </w:rPr>
-              <w:t>package com.uris.crmhrm.task_service;</w:t>
-            </w:r>
-          </w:p>
-          <w:p>
-            <w:pPr>
-              <w:spacing w:before="0" w:after="0"/>
-            </w:pPr>
-            <w:r>
-              <w:rPr>
-                <w:rFonts w:ascii="Consolas" w:hAnsi="Consolas" w:eastAsia="Consolas"/>
-                <w:sz w:val="17"/>
-              </w:rPr>
-              <w:t xml:space="preserve"> </w:t>
-            </w:r>
-          </w:p>
-          <w:p>
-            <w:pPr>
-              <w:spacing w:before="0" w:after="0"/>
-            </w:pPr>
-            <w:r>
-              <w:rPr>
-                <w:rFonts w:ascii="Consolas" w:hAnsi="Consolas" w:eastAsia="Consolas"/>
-                <w:sz w:val="17"/>
-              </w:rPr>
-              <w:t>import org.springframework.beans.factory.annotation.Value;</w:t>
-            </w:r>
-          </w:p>
-          <w:p>
-            <w:pPr>
-              <w:spacing w:before="0" w:after="0"/>
-            </w:pPr>
-            <w:r>
-              <w:rPr>
-                <w:rFonts w:ascii="Consolas" w:hAnsi="Consolas" w:eastAsia="Consolas"/>
-                <w:sz w:val="17"/>
-              </w:rPr>
-              <w:t>import org.springframework.stereotype.Component;</w:t>
-            </w:r>
-          </w:p>
-          <w:p>
-            <w:pPr>
-              <w:spacing w:before="0" w:after="0"/>
-            </w:pPr>
-            <w:r>
-              <w:rPr>
-                <w:rFonts w:ascii="Consolas" w:hAnsi="Consolas" w:eastAsia="Consolas"/>
-                <w:sz w:val="17"/>
-              </w:rPr>
-              <w:t>import org.springframework.web.client.RestClient;</w:t>
-            </w:r>
-          </w:p>
-          <w:p>
-            <w:pPr>
-              <w:spacing w:before="0" w:after="0"/>
-            </w:pPr>
-            <w:r>
-              <w:rPr>
-                <w:rFonts w:ascii="Consolas" w:hAnsi="Consolas" w:eastAsia="Consolas"/>
-                <w:sz w:val="17"/>
-              </w:rPr>
-              <w:t xml:space="preserve"> </w:t>
-            </w:r>
-          </w:p>
-          <w:p>
-            <w:pPr>
-              <w:spacing w:before="0" w:after="0"/>
-            </w:pPr>
-            <w:r>
-              <w:rPr>
-                <w:rFonts w:ascii="Consolas" w:hAnsi="Consolas" w:eastAsia="Consolas"/>
-                <w:sz w:val="17"/>
-              </w:rPr>
-              <w:t>@Component</w:t>
-            </w:r>
-          </w:p>
-          <w:p>
-            <w:pPr>
-              <w:spacing w:before="0" w:after="0"/>
-            </w:pPr>
-            <w:r>
-              <w:rPr>
-                <w:rFonts w:ascii="Consolas" w:hAnsi="Consolas" w:eastAsia="Consolas"/>
-                <w:sz w:val="17"/>
-              </w:rPr>
-              <w:t>public class EmployeeClient {</w:t>
-            </w:r>
-          </w:p>
-          <w:p>
-            <w:pPr>
-              <w:spacing w:before="0" w:after="0"/>
-            </w:pPr>
-            <w:r>
-              <w:rPr>
-                <w:rFonts w:ascii="Consolas" w:hAnsi="Consolas" w:eastAsia="Consolas"/>
-                <w:sz w:val="17"/>
-              </w:rPr>
-              <w:t xml:space="preserve"> </w:t>
-            </w:r>
-          </w:p>
-          <w:p>
-            <w:pPr>
-              <w:spacing w:before="0" w:after="0"/>
-            </w:pPr>
-            <w:r>
-              <w:rPr>
-                <w:rFonts w:ascii="Consolas" w:hAnsi="Consolas" w:eastAsia="Consolas"/>
-                <w:sz w:val="17"/>
-              </w:rPr>
-              <w:t xml:space="preserve">    private final RestClient restClient;</w:t>
-            </w:r>
-          </w:p>
-          <w:p>
-            <w:pPr>
-              <w:spacing w:before="0" w:after="0"/>
-            </w:pPr>
-            <w:r>
-              <w:rPr>
-                <w:rFonts w:ascii="Consolas" w:hAnsi="Consolas" w:eastAsia="Consolas"/>
-                <w:sz w:val="17"/>
-              </w:rPr>
-              <w:t xml:space="preserve"> </w:t>
-            </w:r>
-          </w:p>
-          <w:p>
-            <w:pPr>
-              <w:spacing w:before="0" w:after="0"/>
-            </w:pPr>
-            <w:r>
-              <w:rPr>
-                <w:rFonts w:ascii="Consolas" w:hAnsi="Consolas" w:eastAsia="Consolas"/>
-                <w:sz w:val="17"/>
-              </w:rPr>
-              <w:t xml:space="preserve">    public EmployeeClient(RestClient.Builder restClientBuilder,</w:t>
-            </w:r>
-          </w:p>
-          <w:p>
-            <w:pPr>
-              <w:spacing w:before="0" w:after="0"/>
-            </w:pPr>
-            <w:r>
-              <w:rPr>
-                <w:rFonts w:ascii="Consolas" w:hAnsi="Consolas" w:eastAsia="Consolas"/>
-                <w:sz w:val="17"/>
-              </w:rPr>
-              <w:t xml:space="preserve">            @Value("${employee-service.url}") String employeeServiceUrl) {</w:t>
-            </w:r>
-          </w:p>
-          <w:p>
-            <w:pPr>
-              <w:spacing w:before="0" w:after="0"/>
-            </w:pPr>
-            <w:r>
-              <w:rPr>
-                <w:rFonts w:ascii="Consolas" w:hAnsi="Consolas" w:eastAsia="Consolas"/>
-                <w:sz w:val="17"/>
-              </w:rPr>
-              <w:t xml:space="preserve">        this.restClient = restClientBuilder.baseUrl(employeeServiceUrl).build();</w:t>
-            </w:r>
-          </w:p>
-          <w:p>
-            <w:pPr>
-              <w:spacing w:before="0" w:after="0"/>
-            </w:pPr>
-            <w:r>
-              <w:rPr>
-                <w:rFonts w:ascii="Consolas" w:hAnsi="Consolas" w:eastAsia="Consolas"/>
-                <w:sz w:val="17"/>
-              </w:rPr>
-              <w:t xml:space="preserve">    }</w:t>
-            </w:r>
-          </w:p>
-          <w:p>
-            <w:pPr>
-              <w:spacing w:before="0" w:after="0"/>
-            </w:pPr>
-            <w:r>
-              <w:rPr>
-                <w:rFonts w:ascii="Consolas" w:hAnsi="Consolas" w:eastAsia="Consolas"/>
-                <w:sz w:val="17"/>
-              </w:rPr>
-              <w:t xml:space="preserve"> </w:t>
-            </w:r>
-          </w:p>
-          <w:p>
-            <w:pPr>
-              <w:spacing w:before="0" w:after="0"/>
-            </w:pPr>
-            <w:r>
-              <w:rPr>
-                <w:rFonts w:ascii="Consolas" w:hAnsi="Consolas" w:eastAsia="Consolas"/>
-                <w:sz w:val="17"/>
-              </w:rPr>
-              <w:t xml:space="preserve">    public boolean employeeExists(Long employeeId) {</w:t>
-            </w:r>
-          </w:p>
-          <w:p>
-            <w:pPr>
-              <w:spacing w:before="0" w:after="0"/>
-            </w:pPr>
-            <w:r>
-              <w:rPr>
-                <w:rFonts w:ascii="Consolas" w:hAnsi="Consolas" w:eastAsia="Consolas"/>
-                <w:sz w:val="17"/>
-              </w:rPr>
-              <w:t xml:space="preserve">        return restClient.get()</w:t>
-            </w:r>
-          </w:p>
-          <w:p>
-            <w:pPr>
-              <w:spacing w:before="0" w:after="0"/>
-            </w:pPr>
-            <w:r>
-              <w:rPr>
-                <w:rFonts w:ascii="Consolas" w:hAnsi="Consolas" w:eastAsia="Consolas"/>
-                <w:sz w:val="17"/>
-              </w:rPr>
-              <w:t xml:space="preserve">                .uri("/employees/{id}", employeeId)</w:t>
-            </w:r>
-          </w:p>
-          <w:p>
-            <w:pPr>
-              <w:spacing w:before="0" w:after="0"/>
-            </w:pPr>
-            <w:r>
-              <w:rPr>
-                <w:rFonts w:ascii="Consolas" w:hAnsi="Consolas" w:eastAsia="Consolas"/>
-                <w:sz w:val="17"/>
-              </w:rPr>
-              <w:t xml:space="preserve">                .exchange((request, response) -&gt; response.getStatusCode().is2xxSuccessful());</w:t>
-            </w:r>
-          </w:p>
-          <w:p>
-            <w:pPr>
-              <w:spacing w:before="0" w:after="0"/>
-            </w:pPr>
-            <w:r>
-              <w:rPr>
-                <w:rFonts w:ascii="Consolas" w:hAnsi="Consolas" w:eastAsia="Consolas"/>
-                <w:sz w:val="17"/>
-              </w:rPr>
-              <w:t xml:space="preserve">    }</w:t>
-            </w:r>
-          </w:p>
-          <w:p>
-            <w:pPr>
-              <w:spacing w:before="0" w:after="0"/>
-            </w:pPr>
-            <w:r>
-              <w:rPr>
-                <w:rFonts w:ascii="Consolas" w:hAnsi="Consolas" w:eastAsia="Consolas"/>
-                <w:sz w:val="17"/>
-              </w:rPr>
-              <w:t>}</w:t>
-            </w:r>
-          </w:p>
-        </w:tc>
-      </w:tr>
-    </w:tbl>
+      </w:pPr>
+      <w:r>
+        <w:drawing>
+          <wp:inline xmlns:a="http://schemas.openxmlformats.org/drawingml/2006/main" xmlns:pic="http://schemas.openxmlformats.org/drawingml/2006/picture">
+            <wp:extent cx="5852160" cy="2731690"/>
+            <wp:docPr id="3" name="Picture 3"/>
+            <wp:cNvGraphicFramePr>
+              <a:graphicFrameLocks noChangeAspect="1"/>
+            </wp:cNvGraphicFramePr>
+            <a:graphic>
+              <a:graphicData uri="http://schemas.openxmlformats.org/drawingml/2006/picture">
+                <pic:pic>
+                  <pic:nvPicPr>
+                    <pic:cNvPr id="0" name="snippet_03.png"/>
+                    <pic:cNvPicPr/>
+                  </pic:nvPicPr>
+                  <pic:blipFill>
+                    <a:blip r:embed="rId11"/>
+                    <a:stretch>
+                      <a:fillRect/>
+                    </a:stretch>
+                  </pic:blipFill>
+                  <pic:spPr>
+                    <a:xfrm>
+                      <a:off x="0" y="0"/>
+                      <a:ext cx="5852160" cy="2731690"/>
+                    </a:xfrm>
+                    <a:prstGeom prst="rect"/>
+                  </pic:spPr>
+                </pic:pic>
+              </a:graphicData>
+            </a:graphic>
+          </wp:inline>
+        </w:drawing>
+      </w:r>
+    </w:p>
     <w:p/>
     <w:p>
       <w:pPr>
@@ -2743,86 +2104,45 @@
         <w:t>Objavljivanje dogadjaja na RabbitMQ:</w:t>
       </w:r>
     </w:p>
-    <w:tbl>
-      <w:tblPr>
-        <w:tblStyle w:val="TableGrid"/>
-        <w:tblW w:type="auto" w:w="0"/>
+    <w:p>
+      <w:pPr>
         <w:jc w:val="left"/>
-        <w:tblLook w:firstColumn="1" w:firstRow="1" w:lastColumn="0" w:lastRow="0" w:noHBand="0" w:noVBand="1" w:val="04A0"/>
-      </w:tblPr>
-      <w:tblGrid>
-        <w:gridCol w:w="8640"/>
-      </w:tblGrid>
-      <w:tr>
-        <w:tc>
-          <w:tcPr>
-            <w:tcW w:type="dxa" w:w="8640"/>
-            <w:shd w:val="clear" w:fill="F2F3F5"/>
-          </w:tcPr>
-          <w:p>
-            <w:pPr>
-              <w:spacing w:before="0" w:after="0"/>
-            </w:pPr>
-            <w:r/>
-            <w:r>
-              <w:rPr>
-                <w:rFonts w:ascii="Consolas" w:hAnsi="Consolas" w:eastAsia="Consolas"/>
-                <w:sz w:val="17"/>
-              </w:rPr>
-              <w:t xml:space="preserve">    public void publishTaskCreated(Task task) {</w:t>
-            </w:r>
-          </w:p>
-          <w:p>
-            <w:pPr>
-              <w:spacing w:before="0" w:after="0"/>
-            </w:pPr>
-            <w:r>
-              <w:rPr>
-                <w:rFonts w:ascii="Consolas" w:hAnsi="Consolas" w:eastAsia="Consolas"/>
-                <w:sz w:val="17"/>
-              </w:rPr>
-              <w:t xml:space="preserve">        TaskCreatedEvent event = new TaskCreatedEvent(task.getId(), task.getTitle(), task.getEmployeeId());</w:t>
-            </w:r>
-          </w:p>
-          <w:p>
-            <w:pPr>
-              <w:spacing w:before="0" w:after="0"/>
-            </w:pPr>
-            <w:r>
-              <w:rPr>
-                <w:rFonts w:ascii="Consolas" w:hAnsi="Consolas" w:eastAsia="Consolas"/>
-                <w:sz w:val="17"/>
-              </w:rPr>
-              <w:t xml:space="preserve">        rabbitTemplate.convertAndSend(RabbitMqConfig.EXCHANGE_NAME, RabbitMqConfig.TASK_CREATED_ROUTING_KEY, event);</w:t>
-            </w:r>
-          </w:p>
-          <w:p>
-            <w:pPr>
-              <w:spacing w:before="0" w:after="0"/>
-            </w:pPr>
-            <w:r>
-              <w:rPr>
-                <w:rFonts w:ascii="Consolas" w:hAnsi="Consolas" w:eastAsia="Consolas"/>
-                <w:sz w:val="17"/>
-              </w:rPr>
-              <w:t xml:space="preserve">        log.info("Published {} event for task {}", RabbitMqConfig.TASK_CREATED_ROUTING_KEY, task.getId());</w:t>
-            </w:r>
-          </w:p>
-          <w:p>
-            <w:pPr>
-              <w:spacing w:before="0" w:after="0"/>
-            </w:pPr>
-            <w:r>
-              <w:rPr>
-                <w:rFonts w:ascii="Consolas" w:hAnsi="Consolas" w:eastAsia="Consolas"/>
-                <w:sz w:val="17"/>
-              </w:rPr>
-              <w:t xml:space="preserve">    }</w:t>
-            </w:r>
-          </w:p>
-        </w:tc>
-      </w:tr>
-    </w:tbl>
+      </w:pPr>
+      <w:r>
+        <w:drawing>
+          <wp:inline xmlns:a="http://schemas.openxmlformats.org/drawingml/2006/main" xmlns:pic="http://schemas.openxmlformats.org/drawingml/2006/picture">
+            <wp:extent cx="5852160" cy="609511"/>
+            <wp:docPr id="4" name="Picture 4"/>
+            <wp:cNvGraphicFramePr>
+              <a:graphicFrameLocks noChangeAspect="1"/>
+            </wp:cNvGraphicFramePr>
+            <a:graphic>
+              <a:graphicData uri="http://schemas.openxmlformats.org/drawingml/2006/picture">
+                <pic:pic>
+                  <pic:nvPicPr>
+                    <pic:cNvPr id="0" name="snippet_04.png"/>
+                    <pic:cNvPicPr/>
+                  </pic:nvPicPr>
+                  <pic:blipFill>
+                    <a:blip r:embed="rId12"/>
+                    <a:stretch>
+                      <a:fillRect/>
+                    </a:stretch>
+                  </pic:blipFill>
+                  <pic:spPr>
+                    <a:xfrm>
+                      <a:off x="0" y="0"/>
+                      <a:ext cx="5852160" cy="609511"/>
+                    </a:xfrm>
+                    <a:prstGeom prst="rect"/>
+                  </pic:spPr>
+                </pic:pic>
+              </a:graphicData>
+            </a:graphic>
+          </wp:inline>
+        </w:drawing>
+      </w:r>
+    </w:p>
     <w:p/>
     <w:p>
       <w:pPr>
@@ -2848,98 +2168,45 @@
         <w:t>Konzumiranje dogadjaja u drugom servisu:</w:t>
       </w:r>
     </w:p>
-    <w:tbl>
-      <w:tblPr>
-        <w:tblStyle w:val="TableGrid"/>
-        <w:tblW w:type="auto" w:w="0"/>
+    <w:p>
+      <w:pPr>
         <w:jc w:val="left"/>
-        <w:tblLook w:firstColumn="1" w:firstRow="1" w:lastColumn="0" w:lastRow="0" w:noHBand="0" w:noVBand="1" w:val="04A0"/>
-      </w:tblPr>
-      <w:tblGrid>
-        <w:gridCol w:w="8640"/>
-      </w:tblGrid>
-      <w:tr>
-        <w:tc>
-          <w:tcPr>
-            <w:tcW w:type="dxa" w:w="8640"/>
-            <w:shd w:val="clear" w:fill="F2F3F5"/>
-          </w:tcPr>
-          <w:p>
-            <w:pPr>
-              <w:spacing w:before="0" w:after="0"/>
-            </w:pPr>
-            <w:r/>
-            <w:r>
-              <w:rPr>
-                <w:rFonts w:ascii="Consolas" w:hAnsi="Consolas" w:eastAsia="Consolas"/>
-                <w:sz w:val="17"/>
-              </w:rPr>
-              <w:t xml:space="preserve">    @RabbitListener(queues = RabbitMqConfig.TASK_CREATED_QUEUE)</w:t>
-            </w:r>
-          </w:p>
-          <w:p>
-            <w:pPr>
-              <w:spacing w:before="0" w:after="0"/>
-            </w:pPr>
-            <w:r>
-              <w:rPr>
-                <w:rFonts w:ascii="Consolas" w:hAnsi="Consolas" w:eastAsia="Consolas"/>
-                <w:sz w:val="17"/>
-              </w:rPr>
-              <w:t xml:space="preserve">    public void onTaskCreated(TaskCreatedEvent event) {</w:t>
-            </w:r>
-          </w:p>
-          <w:p>
-            <w:pPr>
-              <w:spacing w:before="0" w:after="0"/>
-            </w:pPr>
-            <w:r>
-              <w:rPr>
-                <w:rFonts w:ascii="Consolas" w:hAnsi="Consolas" w:eastAsia="Consolas"/>
-                <w:sz w:val="17"/>
-              </w:rPr>
-              <w:t xml:space="preserve">        Notification notification = notificationService.record(</w:t>
-            </w:r>
-          </w:p>
-          <w:p>
-            <w:pPr>
-              <w:spacing w:before="0" w:after="0"/>
-            </w:pPr>
-            <w:r>
-              <w:rPr>
-                <w:rFonts w:ascii="Consolas" w:hAnsi="Consolas" w:eastAsia="Consolas"/>
-                <w:sz w:val="17"/>
-              </w:rPr>
-              <w:t xml:space="preserve">                "Kreiran je zadatak: " + event.title(), event.taskId());</w:t>
-            </w:r>
-          </w:p>
-          <w:p>
-            <w:pPr>
-              <w:spacing w:before="0" w:after="0"/>
-            </w:pPr>
-            <w:r>
-              <w:rPr>
-                <w:rFonts w:ascii="Consolas" w:hAnsi="Consolas" w:eastAsia="Consolas"/>
-                <w:sz w:val="17"/>
-              </w:rPr>
-              <w:t xml:space="preserve">        log.info("Stored notification {} for task {}", notification.getId(), event.taskId());</w:t>
-            </w:r>
-          </w:p>
-          <w:p>
-            <w:pPr>
-              <w:spacing w:before="0" w:after="0"/>
-            </w:pPr>
-            <w:r>
-              <w:rPr>
-                <w:rFonts w:ascii="Consolas" w:hAnsi="Consolas" w:eastAsia="Consolas"/>
-                <w:sz w:val="17"/>
-              </w:rPr>
-              <w:t xml:space="preserve">    }</w:t>
-            </w:r>
-          </w:p>
-        </w:tc>
-      </w:tr>
-    </w:tbl>
+      </w:pPr>
+      <w:r>
+        <w:drawing>
+          <wp:inline xmlns:a="http://schemas.openxmlformats.org/drawingml/2006/main" xmlns:pic="http://schemas.openxmlformats.org/drawingml/2006/picture">
+            <wp:extent cx="5852160" cy="886367"/>
+            <wp:docPr id="5" name="Picture 5"/>
+            <wp:cNvGraphicFramePr>
+              <a:graphicFrameLocks noChangeAspect="1"/>
+            </wp:cNvGraphicFramePr>
+            <a:graphic>
+              <a:graphicData uri="http://schemas.openxmlformats.org/drawingml/2006/picture">
+                <pic:pic>
+                  <pic:nvPicPr>
+                    <pic:cNvPr id="0" name="snippet_05.png"/>
+                    <pic:cNvPicPr/>
+                  </pic:nvPicPr>
+                  <pic:blipFill>
+                    <a:blip r:embed="rId13"/>
+                    <a:stretch>
+                      <a:fillRect/>
+                    </a:stretch>
+                  </pic:blipFill>
+                  <pic:spPr>
+                    <a:xfrm>
+                      <a:off x="0" y="0"/>
+                      <a:ext cx="5852160" cy="886367"/>
+                    </a:xfrm>
+                    <a:prstGeom prst="rect"/>
+                  </pic:spPr>
+                </pic:pic>
+              </a:graphicData>
+            </a:graphic>
+          </wp:inline>
+        </w:drawing>
+      </w:r>
+    </w:p>
     <w:p/>
     <w:p>
       <w:pPr>
@@ -2965,134 +2232,45 @@
         <w:t>Reaktivni endpointi, jedan preko Reactor-a i jedan preko RxJava biblioteke:</w:t>
       </w:r>
     </w:p>
-    <w:tbl>
-      <w:tblPr>
-        <w:tblStyle w:val="TableGrid"/>
-        <w:tblW w:type="auto" w:w="0"/>
+    <w:p>
+      <w:pPr>
         <w:jc w:val="left"/>
-        <w:tblLook w:firstColumn="1" w:firstRow="1" w:lastColumn="0" w:lastRow="0" w:noHBand="0" w:noVBand="1" w:val="04A0"/>
-      </w:tblPr>
-      <w:tblGrid>
-        <w:gridCol w:w="8640"/>
-      </w:tblGrid>
-      <w:tr>
-        <w:tc>
-          <w:tcPr>
-            <w:tcW w:type="dxa" w:w="8640"/>
-            <w:shd w:val="clear" w:fill="F2F3F5"/>
-          </w:tcPr>
-          <w:p>
-            <w:pPr>
-              <w:spacing w:before="0" w:after="0"/>
-            </w:pPr>
-            <w:r/>
-            <w:r>
-              <w:rPr>
-                <w:rFonts w:ascii="Consolas" w:hAnsi="Consolas" w:eastAsia="Consolas"/>
-                <w:sz w:val="17"/>
-              </w:rPr>
-              <w:t xml:space="preserve">    @GetMapping(value = "/stream", produces = MediaType.TEXT_EVENT_STREAM_VALUE)</w:t>
-            </w:r>
-          </w:p>
-          <w:p>
-            <w:pPr>
-              <w:spacing w:before="0" w:after="0"/>
-            </w:pPr>
-            <w:r>
-              <w:rPr>
-                <w:rFonts w:ascii="Consolas" w:hAnsi="Consolas" w:eastAsia="Consolas"/>
-                <w:sz w:val="17"/>
-              </w:rPr>
-              <w:t xml:space="preserve">    public Flux&lt;Client&gt; streamClients() {</w:t>
-            </w:r>
-          </w:p>
-          <w:p>
-            <w:pPr>
-              <w:spacing w:before="0" w:after="0"/>
-            </w:pPr>
-            <w:r>
-              <w:rPr>
-                <w:rFonts w:ascii="Consolas" w:hAnsi="Consolas" w:eastAsia="Consolas"/>
-                <w:sz w:val="17"/>
-              </w:rPr>
-              <w:t xml:space="preserve">        return reactiveClientService.streamAll();</w:t>
-            </w:r>
-          </w:p>
-          <w:p>
-            <w:pPr>
-              <w:spacing w:before="0" w:after="0"/>
-            </w:pPr>
-            <w:r>
-              <w:rPr>
-                <w:rFonts w:ascii="Consolas" w:hAnsi="Consolas" w:eastAsia="Consolas"/>
-                <w:sz w:val="17"/>
-              </w:rPr>
-              <w:t xml:space="preserve">    }</w:t>
-            </w:r>
-          </w:p>
-          <w:p>
-            <w:pPr>
-              <w:spacing w:before="0" w:after="0"/>
-            </w:pPr>
-            <w:r>
-              <w:rPr>
-                <w:rFonts w:ascii="Consolas" w:hAnsi="Consolas" w:eastAsia="Consolas"/>
-                <w:sz w:val="17"/>
-              </w:rPr>
-              <w:t xml:space="preserve"> </w:t>
-            </w:r>
-          </w:p>
-          <w:p>
-            <w:pPr>
-              <w:spacing w:before="0" w:after="0"/>
-            </w:pPr>
-            <w:r>
-              <w:rPr>
-                <w:rFonts w:ascii="Consolas" w:hAnsi="Consolas" w:eastAsia="Consolas"/>
-                <w:sz w:val="17"/>
-              </w:rPr>
-              <w:t xml:space="preserve">    @GetMapping(value = "/flowable", produces = MediaType.TEXT_EVENT_STREAM_VALUE)</w:t>
-            </w:r>
-          </w:p>
-          <w:p>
-            <w:pPr>
-              <w:spacing w:before="0" w:after="0"/>
-            </w:pPr>
-            <w:r>
-              <w:rPr>
-                <w:rFonts w:ascii="Consolas" w:hAnsi="Consolas" w:eastAsia="Consolas"/>
-                <w:sz w:val="17"/>
-              </w:rPr>
-              <w:t xml:space="preserve">    public Flowable&lt;Client&gt; streamClientsAsFlowable() {</w:t>
-            </w:r>
-          </w:p>
-          <w:p>
-            <w:pPr>
-              <w:spacing w:before="0" w:after="0"/>
-            </w:pPr>
-            <w:r>
-              <w:rPr>
-                <w:rFonts w:ascii="Consolas" w:hAnsi="Consolas" w:eastAsia="Consolas"/>
-                <w:sz w:val="17"/>
-              </w:rPr>
-              <w:t xml:space="preserve">        return Flowable.fromPublisher(reactiveClientService.streamAll());</w:t>
-            </w:r>
-          </w:p>
-          <w:p>
-            <w:pPr>
-              <w:spacing w:before="0" w:after="0"/>
-            </w:pPr>
-            <w:r>
-              <w:rPr>
-                <w:rFonts w:ascii="Consolas" w:hAnsi="Consolas" w:eastAsia="Consolas"/>
-                <w:sz w:val="17"/>
-              </w:rPr>
-              <w:t xml:space="preserve">    }</w:t>
-            </w:r>
-          </w:p>
-        </w:tc>
-      </w:tr>
-    </w:tbl>
+      </w:pPr>
+      <w:r>
+        <w:drawing>
+          <wp:inline xmlns:a="http://schemas.openxmlformats.org/drawingml/2006/main" xmlns:pic="http://schemas.openxmlformats.org/drawingml/2006/picture">
+            <wp:extent cx="5852160" cy="1426616"/>
+            <wp:docPr id="6" name="Picture 6"/>
+            <wp:cNvGraphicFramePr>
+              <a:graphicFrameLocks noChangeAspect="1"/>
+            </wp:cNvGraphicFramePr>
+            <a:graphic>
+              <a:graphicData uri="http://schemas.openxmlformats.org/drawingml/2006/picture">
+                <pic:pic>
+                  <pic:nvPicPr>
+                    <pic:cNvPr id="0" name="snippet_06.png"/>
+                    <pic:cNvPicPr/>
+                  </pic:nvPicPr>
+                  <pic:blipFill>
+                    <a:blip r:embed="rId14"/>
+                    <a:stretch>
+                      <a:fillRect/>
+                    </a:stretch>
+                  </pic:blipFill>
+                  <pic:spPr>
+                    <a:xfrm>
+                      <a:off x="0" y="0"/>
+                      <a:ext cx="5852160" cy="1426616"/>
+                    </a:xfrm>
+                    <a:prstGeom prst="rect"/>
+                  </pic:spPr>
+                </pic:pic>
+              </a:graphicData>
+            </a:graphic>
+          </wp:inline>
+        </w:drawing>
+      </w:r>
+    </w:p>
     <w:p/>
     <w:p>
       <w:pPr>
@@ -3413,314 +2591,45 @@
         <w:t>End-to-end provera celog lanca, sa cekanjem na asinhronu notifikaciju:</w:t>
       </w:r>
     </w:p>
-    <w:tbl>
-      <w:tblPr>
-        <w:tblStyle w:val="TableGrid"/>
-        <w:tblW w:type="auto" w:w="0"/>
+    <w:p>
+      <w:pPr>
         <w:jc w:val="left"/>
-        <w:tblLook w:firstColumn="1" w:firstRow="1" w:lastColumn="0" w:lastRow="0" w:noHBand="0" w:noVBand="1" w:val="04A0"/>
-      </w:tblPr>
-      <w:tblGrid>
-        <w:gridCol w:w="8640"/>
-      </w:tblGrid>
-      <w:tr>
-        <w:tc>
-          <w:tcPr>
-            <w:tcW w:type="dxa" w:w="8640"/>
-            <w:shd w:val="clear" w:fill="F2F3F5"/>
-          </w:tcPr>
-          <w:p>
-            <w:pPr>
-              <w:spacing w:before="0" w:after="0"/>
-            </w:pPr>
-            <w:r/>
-            <w:r>
-              <w:rPr>
-                <w:rFonts w:ascii="Consolas" w:hAnsi="Consolas" w:eastAsia="Consolas"/>
-                <w:sz w:val="17"/>
-              </w:rPr>
-              <w:t xml:space="preserve">    @Test</w:t>
-            </w:r>
-          </w:p>
-          <w:p>
-            <w:pPr>
-              <w:spacing w:before="0" w:after="0"/>
-            </w:pPr>
-            <w:r>
-              <w:rPr>
-                <w:rFonts w:ascii="Consolas" w:hAnsi="Consolas" w:eastAsia="Consolas"/>
-                <w:sz w:val="17"/>
-              </w:rPr>
-              <w:t xml:space="preserve">    void createdTaskEventuallyProducesNotification() {</w:t>
-            </w:r>
-          </w:p>
-          <w:p>
-            <w:pPr>
-              <w:spacing w:before="0" w:after="0"/>
-            </w:pPr>
-            <w:r>
-              <w:rPr>
-                <w:rFonts w:ascii="Consolas" w:hAnsi="Consolas" w:eastAsia="Consolas"/>
-                <w:sz w:val="17"/>
-              </w:rPr>
-              <w:t xml:space="preserve">        String title = "E2E zadatak " + UUID.randomUUID();</w:t>
-            </w:r>
-          </w:p>
-          <w:p>
-            <w:pPr>
-              <w:spacing w:before="0" w:after="0"/>
-            </w:pPr>
-            <w:r>
-              <w:rPr>
-                <w:rFonts w:ascii="Consolas" w:hAnsi="Consolas" w:eastAsia="Consolas"/>
-                <w:sz w:val="17"/>
-              </w:rPr>
-              <w:t xml:space="preserve">        int employeeId = createEmployee();</w:t>
-            </w:r>
-          </w:p>
-          <w:p>
-            <w:pPr>
-              <w:spacing w:before="0" w:after="0"/>
-            </w:pPr>
-            <w:r>
-              <w:rPr>
-                <w:rFonts w:ascii="Consolas" w:hAnsi="Consolas" w:eastAsia="Consolas"/>
-                <w:sz w:val="17"/>
-              </w:rPr>
-              <w:t xml:space="preserve"> </w:t>
-            </w:r>
-          </w:p>
-          <w:p>
-            <w:pPr>
-              <w:spacing w:before="0" w:after="0"/>
-            </w:pPr>
-            <w:r>
-              <w:rPr>
-                <w:rFonts w:ascii="Consolas" w:hAnsi="Consolas" w:eastAsia="Consolas"/>
-                <w:sz w:val="17"/>
-              </w:rPr>
-              <w:t xml:space="preserve">        int taskId = given()</w:t>
-            </w:r>
-          </w:p>
-          <w:p>
-            <w:pPr>
-              <w:spacing w:before="0" w:after="0"/>
-            </w:pPr>
-            <w:r>
-              <w:rPr>
-                <w:rFonts w:ascii="Consolas" w:hAnsi="Consolas" w:eastAsia="Consolas"/>
-                <w:sz w:val="17"/>
-              </w:rPr>
-              <w:t xml:space="preserve">                .baseUri(ServiceEndpoints.gateway())</w:t>
-            </w:r>
-          </w:p>
-          <w:p>
-            <w:pPr>
-              <w:spacing w:before="0" w:after="0"/>
-            </w:pPr>
-            <w:r>
-              <w:rPr>
-                <w:rFonts w:ascii="Consolas" w:hAnsi="Consolas" w:eastAsia="Consolas"/>
-                <w:sz w:val="17"/>
-              </w:rPr>
-              <w:t xml:space="preserve">                .contentType(ContentType.JSON)</w:t>
-            </w:r>
-          </w:p>
-          <w:p>
-            <w:pPr>
-              <w:spacing w:before="0" w:after="0"/>
-            </w:pPr>
-            <w:r>
-              <w:rPr>
-                <w:rFonts w:ascii="Consolas" w:hAnsi="Consolas" w:eastAsia="Consolas"/>
-                <w:sz w:val="17"/>
-              </w:rPr>
-              <w:t xml:space="preserve">                .body(taskPayload(title, employeeId))</w:t>
-            </w:r>
-          </w:p>
-          <w:p>
-            <w:pPr>
-              <w:spacing w:before="0" w:after="0"/>
-            </w:pPr>
-            <w:r>
-              <w:rPr>
-                <w:rFonts w:ascii="Consolas" w:hAnsi="Consolas" w:eastAsia="Consolas"/>
-                <w:sz w:val="17"/>
-              </w:rPr>
-              <w:t xml:space="preserve">        .when()</w:t>
-            </w:r>
-          </w:p>
-          <w:p>
-            <w:pPr>
-              <w:spacing w:before="0" w:after="0"/>
-            </w:pPr>
-            <w:r>
-              <w:rPr>
-                <w:rFonts w:ascii="Consolas" w:hAnsi="Consolas" w:eastAsia="Consolas"/>
-                <w:sz w:val="17"/>
-              </w:rPr>
-              <w:t xml:space="preserve">                .post("/api/tasks")</w:t>
-            </w:r>
-          </w:p>
-          <w:p>
-            <w:pPr>
-              <w:spacing w:before="0" w:after="0"/>
-            </w:pPr>
-            <w:r>
-              <w:rPr>
-                <w:rFonts w:ascii="Consolas" w:hAnsi="Consolas" w:eastAsia="Consolas"/>
-                <w:sz w:val="17"/>
-              </w:rPr>
-              <w:t xml:space="preserve">        .then()</w:t>
-            </w:r>
-          </w:p>
-          <w:p>
-            <w:pPr>
-              <w:spacing w:before="0" w:after="0"/>
-            </w:pPr>
-            <w:r>
-              <w:rPr>
-                <w:rFonts w:ascii="Consolas" w:hAnsi="Consolas" w:eastAsia="Consolas"/>
-                <w:sz w:val="17"/>
-              </w:rPr>
-              <w:t xml:space="preserve">                .statusCode(201)</w:t>
-            </w:r>
-          </w:p>
-          <w:p>
-            <w:pPr>
-              <w:spacing w:before="0" w:after="0"/>
-            </w:pPr>
-            <w:r>
-              <w:rPr>
-                <w:rFonts w:ascii="Consolas" w:hAnsi="Consolas" w:eastAsia="Consolas"/>
-                <w:sz w:val="17"/>
-              </w:rPr>
-              <w:t xml:space="preserve">                .extract().path("id");</w:t>
-            </w:r>
-          </w:p>
-          <w:p>
-            <w:pPr>
-              <w:spacing w:before="0" w:after="0"/>
-            </w:pPr>
-            <w:r>
-              <w:rPr>
-                <w:rFonts w:ascii="Consolas" w:hAnsi="Consolas" w:eastAsia="Consolas"/>
-                <w:sz w:val="17"/>
-              </w:rPr>
-              <w:t xml:space="preserve"> </w:t>
-            </w:r>
-          </w:p>
-          <w:p>
-            <w:pPr>
-              <w:spacing w:before="0" w:after="0"/>
-            </w:pPr>
-            <w:r>
-              <w:rPr>
-                <w:rFonts w:ascii="Consolas" w:hAnsi="Consolas" w:eastAsia="Consolas"/>
-                <w:sz w:val="17"/>
-              </w:rPr>
-              <w:t xml:space="preserve">        await().atMost(NOTIFICATION_TIMEOUT).pollInterval(POLL_INTERVAL).untilAsserted(() -&gt;</w:t>
-            </w:r>
-          </w:p>
-          <w:p>
-            <w:pPr>
-              <w:spacing w:before="0" w:after="0"/>
-            </w:pPr>
-            <w:r>
-              <w:rPr>
-                <w:rFonts w:ascii="Consolas" w:hAnsi="Consolas" w:eastAsia="Consolas"/>
-                <w:sz w:val="17"/>
-              </w:rPr>
-              <w:t xml:space="preserve">                given()</w:t>
-            </w:r>
-          </w:p>
-          <w:p>
-            <w:pPr>
-              <w:spacing w:before="0" w:after="0"/>
-            </w:pPr>
-            <w:r>
-              <w:rPr>
-                <w:rFonts w:ascii="Consolas" w:hAnsi="Consolas" w:eastAsia="Consolas"/>
-                <w:sz w:val="17"/>
-              </w:rPr>
-              <w:t xml:space="preserve">                        .baseUri(ServiceEndpoints.gateway())</w:t>
-            </w:r>
-          </w:p>
-          <w:p>
-            <w:pPr>
-              <w:spacing w:before="0" w:after="0"/>
-            </w:pPr>
-            <w:r>
-              <w:rPr>
-                <w:rFonts w:ascii="Consolas" w:hAnsi="Consolas" w:eastAsia="Consolas"/>
-                <w:sz w:val="17"/>
-              </w:rPr>
-              <w:t xml:space="preserve">                .when()</w:t>
-            </w:r>
-          </w:p>
-          <w:p>
-            <w:pPr>
-              <w:spacing w:before="0" w:after="0"/>
-            </w:pPr>
-            <w:r>
-              <w:rPr>
-                <w:rFonts w:ascii="Consolas" w:hAnsi="Consolas" w:eastAsia="Consolas"/>
-                <w:sz w:val="17"/>
-              </w:rPr>
-              <w:t xml:space="preserve">                        .get("/api/notifications")</w:t>
-            </w:r>
-          </w:p>
-          <w:p>
-            <w:pPr>
-              <w:spacing w:before="0" w:after="0"/>
-            </w:pPr>
-            <w:r>
-              <w:rPr>
-                <w:rFonts w:ascii="Consolas" w:hAnsi="Consolas" w:eastAsia="Consolas"/>
-                <w:sz w:val="17"/>
-              </w:rPr>
-              <w:t xml:space="preserve">                .then()</w:t>
-            </w:r>
-          </w:p>
-          <w:p>
-            <w:pPr>
-              <w:spacing w:before="0" w:after="0"/>
-            </w:pPr>
-            <w:r>
-              <w:rPr>
-                <w:rFonts w:ascii="Consolas" w:hAnsi="Consolas" w:eastAsia="Consolas"/>
-                <w:sz w:val="17"/>
-              </w:rPr>
-              <w:t xml:space="preserve">                        .statusCode(200)</w:t>
-            </w:r>
-          </w:p>
-          <w:p>
-            <w:pPr>
-              <w:spacing w:before="0" w:after="0"/>
-            </w:pPr>
-            <w:r>
-              <w:rPr>
-                <w:rFonts w:ascii="Consolas" w:hAnsi="Consolas" w:eastAsia="Consolas"/>
-                <w:sz w:val="17"/>
-              </w:rPr>
-              <w:t xml:space="preserve">                        .body("findAll { it.taskId == " + taskId + " }.message", hasItem("Kreiran je zadatak: " + title)));</w:t>
-            </w:r>
-          </w:p>
-          <w:p>
-            <w:pPr>
-              <w:spacing w:before="0" w:after="0"/>
-            </w:pPr>
-            <w:r>
-              <w:rPr>
-                <w:rFonts w:ascii="Consolas" w:hAnsi="Consolas" w:eastAsia="Consolas"/>
-                <w:sz w:val="17"/>
-              </w:rPr>
-              <w:t xml:space="preserve">    }</w:t>
-            </w:r>
-          </w:p>
-        </w:tc>
-      </w:tr>
-    </w:tbl>
+      </w:pPr>
+      <w:r>
+        <w:drawing>
+          <wp:inline xmlns:a="http://schemas.openxmlformats.org/drawingml/2006/main" xmlns:pic="http://schemas.openxmlformats.org/drawingml/2006/picture">
+            <wp:extent cx="5852160" cy="2331218"/>
+            <wp:docPr id="7" name="Picture 7"/>
+            <wp:cNvGraphicFramePr>
+              <a:graphicFrameLocks noChangeAspect="1"/>
+            </wp:cNvGraphicFramePr>
+            <a:graphic>
+              <a:graphicData uri="http://schemas.openxmlformats.org/drawingml/2006/picture">
+                <pic:pic>
+                  <pic:nvPicPr>
+                    <pic:cNvPr id="0" name="snippet_07.png"/>
+                    <pic:cNvPicPr/>
+                  </pic:nvPicPr>
+                  <pic:blipFill>
+                    <a:blip r:embed="rId15"/>
+                    <a:stretch>
+                      <a:fillRect/>
+                    </a:stretch>
+                  </pic:blipFill>
+                  <pic:spPr>
+                    <a:xfrm>
+                      <a:off x="0" y="0"/>
+                      <a:ext cx="5852160" cy="2331218"/>
+                    </a:xfrm>
+                    <a:prstGeom prst="rect"/>
+                  </pic:spPr>
+                </pic:pic>
+              </a:graphicData>
+            </a:graphic>
+          </wp:inline>
+        </w:drawing>
+      </w:r>
+    </w:p>
     <w:p/>
     <w:p>
       <w:pPr>
@@ -3757,230 +2666,45 @@
         <w:t>CI se pokrece automatski na svaki push i svaki pull request. Obuhvata build svih pet servisa kroz jedan aggregator POM, izvrsavanje svih testova, SonarCloud analizu sa JaCoCo izvestajem o pokrivenosti, upload build artefakata, Docker build svih pet image-a paralelno kroz matrix strategiju, i end-to-end testove nad podignutim sistemom.</w:t>
       </w:r>
     </w:p>
-    <w:tbl>
-      <w:tblPr>
-        <w:tblStyle w:val="TableGrid"/>
-        <w:tblW w:type="auto" w:w="0"/>
+    <w:p>
+      <w:pPr>
         <w:jc w:val="left"/>
-        <w:tblLook w:firstColumn="1" w:firstRow="1" w:lastColumn="0" w:lastRow="0" w:noHBand="0" w:noVBand="1" w:val="04A0"/>
-      </w:tblPr>
-      <w:tblGrid>
-        <w:gridCol w:w="8640"/>
-      </w:tblGrid>
-      <w:tr>
-        <w:tc>
-          <w:tcPr>
-            <w:tcW w:type="dxa" w:w="8640"/>
-            <w:shd w:val="clear" w:fill="F2F3F5"/>
-          </w:tcPr>
-          <w:p>
-            <w:pPr>
-              <w:spacing w:before="0" w:after="0"/>
-            </w:pPr>
-            <w:r/>
-            <w:r>
-              <w:rPr>
-                <w:rFonts w:ascii="Consolas" w:hAnsi="Consolas" w:eastAsia="Consolas"/>
-                <w:sz w:val="17"/>
-              </w:rPr>
-              <w:t xml:space="preserve">      - name: Build i test svih servisa</w:t>
-            </w:r>
-          </w:p>
-          <w:p>
-            <w:pPr>
-              <w:spacing w:before="0" w:after="0"/>
-            </w:pPr>
-            <w:r>
-              <w:rPr>
-                <w:rFonts w:ascii="Consolas" w:hAnsi="Consolas" w:eastAsia="Consolas"/>
-                <w:sz w:val="17"/>
-              </w:rPr>
-              <w:t xml:space="preserve">        run: mvn -B -f backend/pom.xml verify</w:t>
-            </w:r>
-          </w:p>
-          <w:p>
-            <w:pPr>
-              <w:spacing w:before="0" w:after="0"/>
-            </w:pPr>
-            <w:r>
-              <w:rPr>
-                <w:rFonts w:ascii="Consolas" w:hAnsi="Consolas" w:eastAsia="Consolas"/>
-                <w:sz w:val="17"/>
-              </w:rPr>
-              <w:t xml:space="preserve"> </w:t>
-            </w:r>
-          </w:p>
-          <w:p>
-            <w:pPr>
-              <w:spacing w:before="0" w:after="0"/>
-            </w:pPr>
-            <w:r>
-              <w:rPr>
-                <w:rFonts w:ascii="Consolas" w:hAnsi="Consolas" w:eastAsia="Consolas"/>
-                <w:sz w:val="17"/>
-              </w:rPr>
-              <w:t xml:space="preserve">      - name: SonarCloud Scan</w:t>
-            </w:r>
-          </w:p>
-          <w:p>
-            <w:pPr>
-              <w:spacing w:before="0" w:after="0"/>
-            </w:pPr>
-            <w:r>
-              <w:rPr>
-                <w:rFonts w:ascii="Consolas" w:hAnsi="Consolas" w:eastAsia="Consolas"/>
-                <w:sz w:val="17"/>
-              </w:rPr>
-              <w:t xml:space="preserve">        if: github.event_name == 'pull_request' || github.ref == 'refs/heads/main'</w:t>
-            </w:r>
-          </w:p>
-          <w:p>
-            <w:pPr>
-              <w:spacing w:before="0" w:after="0"/>
-            </w:pPr>
-            <w:r>
-              <w:rPr>
-                <w:rFonts w:ascii="Consolas" w:hAnsi="Consolas" w:eastAsia="Consolas"/>
-                <w:sz w:val="17"/>
-              </w:rPr>
-              <w:t xml:space="preserve">        env:</w:t>
-            </w:r>
-          </w:p>
-          <w:p>
-            <w:pPr>
-              <w:spacing w:before="0" w:after="0"/>
-            </w:pPr>
-            <w:r>
-              <w:rPr>
-                <w:rFonts w:ascii="Consolas" w:hAnsi="Consolas" w:eastAsia="Consolas"/>
-                <w:sz w:val="17"/>
-              </w:rPr>
-              <w:t xml:space="preserve">          GITHUB_TOKEN: ${{ secrets.GITHUB_TOKEN }}</w:t>
-            </w:r>
-          </w:p>
-          <w:p>
-            <w:pPr>
-              <w:spacing w:before="0" w:after="0"/>
-            </w:pPr>
-            <w:r>
-              <w:rPr>
-                <w:rFonts w:ascii="Consolas" w:hAnsi="Consolas" w:eastAsia="Consolas"/>
-                <w:sz w:val="17"/>
-              </w:rPr>
-              <w:t xml:space="preserve">          SONAR_TOKEN: ${{ secrets.SONAR_TOKEN }}</w:t>
-            </w:r>
-          </w:p>
-          <w:p>
-            <w:pPr>
-              <w:spacing w:before="0" w:after="0"/>
-            </w:pPr>
-            <w:r>
-              <w:rPr>
-                <w:rFonts w:ascii="Consolas" w:hAnsi="Consolas" w:eastAsia="Consolas"/>
-                <w:sz w:val="17"/>
-              </w:rPr>
-              <w:t xml:space="preserve">        run: mvn -B -f backend/pom.xml org.sonarsource.scanner.maven:sonar-maven-plugin:5.7.0.6970:sonar -Dsonar.qualitygate.wait=true</w:t>
-            </w:r>
-          </w:p>
-          <w:p>
-            <w:pPr>
-              <w:spacing w:before="0" w:after="0"/>
-            </w:pPr>
-            <w:r>
-              <w:rPr>
-                <w:rFonts w:ascii="Consolas" w:hAnsi="Consolas" w:eastAsia="Consolas"/>
-                <w:sz w:val="17"/>
-              </w:rPr>
-              <w:t xml:space="preserve"> </w:t>
-            </w:r>
-          </w:p>
-          <w:p>
-            <w:pPr>
-              <w:spacing w:before="0" w:after="0"/>
-            </w:pPr>
-            <w:r>
-              <w:rPr>
-                <w:rFonts w:ascii="Consolas" w:hAnsi="Consolas" w:eastAsia="Consolas"/>
-                <w:sz w:val="17"/>
-              </w:rPr>
-              <w:t xml:space="preserve">      - name: Upload build artefakata</w:t>
-            </w:r>
-          </w:p>
-          <w:p>
-            <w:pPr>
-              <w:spacing w:before="0" w:after="0"/>
-            </w:pPr>
-            <w:r>
-              <w:rPr>
-                <w:rFonts w:ascii="Consolas" w:hAnsi="Consolas" w:eastAsia="Consolas"/>
-                <w:sz w:val="17"/>
-              </w:rPr>
-              <w:t xml:space="preserve">        uses: actions/upload-artifact@v4</w:t>
-            </w:r>
-          </w:p>
-          <w:p>
-            <w:pPr>
-              <w:spacing w:before="0" w:after="0"/>
-            </w:pPr>
-            <w:r>
-              <w:rPr>
-                <w:rFonts w:ascii="Consolas" w:hAnsi="Consolas" w:eastAsia="Consolas"/>
-                <w:sz w:val="17"/>
-              </w:rPr>
-              <w:t xml:space="preserve">        with:</w:t>
-            </w:r>
-          </w:p>
-          <w:p>
-            <w:pPr>
-              <w:spacing w:before="0" w:after="0"/>
-            </w:pPr>
-            <w:r>
-              <w:rPr>
-                <w:rFonts w:ascii="Consolas" w:hAnsi="Consolas" w:eastAsia="Consolas"/>
-                <w:sz w:val="17"/>
-              </w:rPr>
-              <w:t xml:space="preserve">          name: service-jars</w:t>
-            </w:r>
-          </w:p>
-          <w:p>
-            <w:pPr>
-              <w:spacing w:before="0" w:after="0"/>
-            </w:pPr>
-            <w:r>
-              <w:rPr>
-                <w:rFonts w:ascii="Consolas" w:hAnsi="Consolas" w:eastAsia="Consolas"/>
-                <w:sz w:val="17"/>
-              </w:rPr>
-              <w:t xml:space="preserve">          path: backend/*/target/*.jar</w:t>
-            </w:r>
-          </w:p>
-          <w:p>
-            <w:pPr>
-              <w:spacing w:before="0" w:after="0"/>
-            </w:pPr>
-            <w:r>
-              <w:rPr>
-                <w:rFonts w:ascii="Consolas" w:hAnsi="Consolas" w:eastAsia="Consolas"/>
-                <w:sz w:val="17"/>
-              </w:rPr>
-              <w:t xml:space="preserve">          if-no-files-found: error</w:t>
-            </w:r>
-          </w:p>
-          <w:p>
-            <w:pPr>
-              <w:spacing w:before="0" w:after="0"/>
-            </w:pPr>
-            <w:r>
-              <w:rPr>
-                <w:rFonts w:ascii="Consolas" w:hAnsi="Consolas" w:eastAsia="Consolas"/>
-                <w:sz w:val="17"/>
-              </w:rPr>
-              <w:t xml:space="preserve">          retention-days: 7</w:t>
-            </w:r>
-          </w:p>
-        </w:tc>
-      </w:tr>
-    </w:tbl>
+      </w:pPr>
+      <w:r>
+        <w:drawing>
+          <wp:inline xmlns:a="http://schemas.openxmlformats.org/drawingml/2006/main" xmlns:pic="http://schemas.openxmlformats.org/drawingml/2006/picture">
+            <wp:extent cx="5852160" cy="1567810"/>
+            <wp:docPr id="8" name="Picture 8"/>
+            <wp:cNvGraphicFramePr>
+              <a:graphicFrameLocks noChangeAspect="1"/>
+            </wp:cNvGraphicFramePr>
+            <a:graphic>
+              <a:graphicData uri="http://schemas.openxmlformats.org/drawingml/2006/picture">
+                <pic:pic>
+                  <pic:nvPicPr>
+                    <pic:cNvPr id="0" name="snippet_08.png"/>
+                    <pic:cNvPicPr/>
+                  </pic:nvPicPr>
+                  <pic:blipFill>
+                    <a:blip r:embed="rId16"/>
+                    <a:stretch>
+                      <a:fillRect/>
+                    </a:stretch>
+                  </pic:blipFill>
+                  <pic:spPr>
+                    <a:xfrm>
+                      <a:off x="0" y="0"/>
+                      <a:ext cx="5852160" cy="1567810"/>
+                    </a:xfrm>
+                    <a:prstGeom prst="rect"/>
+                  </pic:spPr>
+                </pic:pic>
+              </a:graphicData>
+            </a:graphic>
+          </wp:inline>
+        </w:drawing>
+      </w:r>
+    </w:p>
     <w:p/>
     <w:p>
       <w:pPr>
@@ -4030,170 +2754,45 @@
         <w:t>-om. Build je multi-stage: build faza koristi Maven image, runtime faza samo JRE, pa finalni image ne sadrzi Maven ni izvorni kod.</w:t>
       </w:r>
     </w:p>
-    <w:tbl>
-      <w:tblPr>
-        <w:tblStyle w:val="TableGrid"/>
-        <w:tblW w:type="auto" w:w="0"/>
+    <w:p>
+      <w:pPr>
         <w:jc w:val="left"/>
-        <w:tblLook w:firstColumn="1" w:firstRow="1" w:lastColumn="0" w:lastRow="0" w:noHBand="0" w:noVBand="1" w:val="04A0"/>
-      </w:tblPr>
-      <w:tblGrid>
-        <w:gridCol w:w="8640"/>
-      </w:tblGrid>
-      <w:tr>
-        <w:tc>
-          <w:tcPr>
-            <w:tcW w:type="dxa" w:w="8640"/>
-            <w:shd w:val="clear" w:fill="F2F3F5"/>
-          </w:tcPr>
-          <w:p>
-            <w:pPr>
-              <w:spacing w:before="0" w:after="0"/>
-            </w:pPr>
-            <w:r/>
-            <w:r>
-              <w:rPr>
-                <w:rFonts w:ascii="Consolas" w:hAnsi="Consolas" w:eastAsia="Consolas"/>
-                <w:sz w:val="17"/>
-              </w:rPr>
-              <w:t>FROM maven:3.9.6-eclipse-temurin-17 AS build</w:t>
-            </w:r>
-          </w:p>
-          <w:p>
-            <w:pPr>
-              <w:spacing w:before="0" w:after="0"/>
-            </w:pPr>
-            <w:r>
-              <w:rPr>
-                <w:rFonts w:ascii="Consolas" w:hAnsi="Consolas" w:eastAsia="Consolas"/>
-                <w:sz w:val="17"/>
-              </w:rPr>
-              <w:t>WORKDIR /app</w:t>
-            </w:r>
-          </w:p>
-          <w:p>
-            <w:pPr>
-              <w:spacing w:before="0" w:after="0"/>
-            </w:pPr>
-            <w:r>
-              <w:rPr>
-                <w:rFonts w:ascii="Consolas" w:hAnsi="Consolas" w:eastAsia="Consolas"/>
-                <w:sz w:val="17"/>
-              </w:rPr>
-              <w:t>COPY pom.xml .</w:t>
-            </w:r>
-          </w:p>
-          <w:p>
-            <w:pPr>
-              <w:spacing w:before="0" w:after="0"/>
-            </w:pPr>
-            <w:r>
-              <w:rPr>
-                <w:rFonts w:ascii="Consolas" w:hAnsi="Consolas" w:eastAsia="Consolas"/>
-                <w:sz w:val="17"/>
-              </w:rPr>
-              <w:t>COPY src ./src</w:t>
-            </w:r>
-          </w:p>
-          <w:p>
-            <w:pPr>
-              <w:spacing w:before="0" w:after="0"/>
-            </w:pPr>
-            <w:r>
-              <w:rPr>
-                <w:rFonts w:ascii="Consolas" w:hAnsi="Consolas" w:eastAsia="Consolas"/>
-                <w:sz w:val="17"/>
-              </w:rPr>
-              <w:t>RUN mvn -B clean package -DskipTests</w:t>
-            </w:r>
-          </w:p>
-          <w:p>
-            <w:pPr>
-              <w:spacing w:before="0" w:after="0"/>
-            </w:pPr>
-            <w:r>
-              <w:rPr>
-                <w:rFonts w:ascii="Consolas" w:hAnsi="Consolas" w:eastAsia="Consolas"/>
-                <w:sz w:val="17"/>
-              </w:rPr>
-              <w:t xml:space="preserve"> </w:t>
-            </w:r>
-          </w:p>
-          <w:p>
-            <w:pPr>
-              <w:spacing w:before="0" w:after="0"/>
-            </w:pPr>
-            <w:r>
-              <w:rPr>
-                <w:rFonts w:ascii="Consolas" w:hAnsi="Consolas" w:eastAsia="Consolas"/>
-                <w:sz w:val="17"/>
-              </w:rPr>
-              <w:t>FROM eclipse-temurin:17-jre</w:t>
-            </w:r>
-          </w:p>
-          <w:p>
-            <w:pPr>
-              <w:spacing w:before="0" w:after="0"/>
-            </w:pPr>
-            <w:r>
-              <w:rPr>
-                <w:rFonts w:ascii="Consolas" w:hAnsi="Consolas" w:eastAsia="Consolas"/>
-                <w:sz w:val="17"/>
-              </w:rPr>
-              <w:t>RUN apt-get update &amp;&amp; apt-get install -y --no-install-recommends curl &amp;&amp; rm -rf /var/lib/apt/lists/*</w:t>
-            </w:r>
-          </w:p>
-          <w:p>
-            <w:pPr>
-              <w:spacing w:before="0" w:after="0"/>
-            </w:pPr>
-            <w:r>
-              <w:rPr>
-                <w:rFonts w:ascii="Consolas" w:hAnsi="Consolas" w:eastAsia="Consolas"/>
-                <w:sz w:val="17"/>
-              </w:rPr>
-              <w:t>WORKDIR /app</w:t>
-            </w:r>
-          </w:p>
-          <w:p>
-            <w:pPr>
-              <w:spacing w:before="0" w:after="0"/>
-            </w:pPr>
-            <w:r>
-              <w:rPr>
-                <w:rFonts w:ascii="Consolas" w:hAnsi="Consolas" w:eastAsia="Consolas"/>
-                <w:sz w:val="17"/>
-              </w:rPr>
-              <w:t>COPY --from=build /app/target/*.jar app.jar</w:t>
-            </w:r>
-          </w:p>
-          <w:p>
-            <w:pPr>
-              <w:spacing w:before="0" w:after="0"/>
-            </w:pPr>
-            <w:r>
-              <w:rPr>
-                <w:rFonts w:ascii="Consolas" w:hAnsi="Consolas" w:eastAsia="Consolas"/>
-                <w:sz w:val="17"/>
-              </w:rPr>
-              <w:t>EXPOSE 8081</w:t>
-            </w:r>
-          </w:p>
-          <w:p>
-            <w:pPr>
-              <w:spacing w:before="0" w:after="0"/>
-            </w:pPr>
-            <w:r>
-              <w:rPr>
-                <w:rFonts w:ascii="Consolas" w:hAnsi="Consolas" w:eastAsia="Consolas"/>
-                <w:sz w:val="17"/>
-              </w:rPr>
-              <w:t>ENTRYPOINT ["java", "-jar", "app.jar"]</w:t>
-            </w:r>
-          </w:p>
-        </w:tc>
-      </w:tr>
-    </w:tbl>
+      </w:pPr>
+      <w:r>
+        <w:drawing>
+          <wp:inline xmlns:a="http://schemas.openxmlformats.org/drawingml/2006/main" xmlns:pic="http://schemas.openxmlformats.org/drawingml/2006/picture">
+            <wp:extent cx="5852160" cy="1446388"/>
+            <wp:docPr id="9" name="Picture 9"/>
+            <wp:cNvGraphicFramePr>
+              <a:graphicFrameLocks noChangeAspect="1"/>
+            </wp:cNvGraphicFramePr>
+            <a:graphic>
+              <a:graphicData uri="http://schemas.openxmlformats.org/drawingml/2006/picture">
+                <pic:pic>
+                  <pic:nvPicPr>
+                    <pic:cNvPr id="0" name="snippet_09.png"/>
+                    <pic:cNvPicPr/>
+                  </pic:nvPicPr>
+                  <pic:blipFill>
+                    <a:blip r:embed="rId17"/>
+                    <a:stretch>
+                      <a:fillRect/>
+                    </a:stretch>
+                  </pic:blipFill>
+                  <pic:spPr>
+                    <a:xfrm>
+                      <a:off x="0" y="0"/>
+                      <a:ext cx="5852160" cy="1446388"/>
+                    </a:xfrm>
+                    <a:prstGeom prst="rect"/>
+                  </pic:spPr>
+                </pic:pic>
+              </a:graphicData>
+            </a:graphic>
+          </wp:inline>
+        </w:drawing>
+      </w:r>
+    </w:p>
     <w:p/>
     <w:p>
       <w:pPr>
@@ -4596,458 +3195,45 @@
         <w:t>Primer definicije jednog servisa, sa healthcheck-om i cekanjem na zdrave zavisnosti:</w:t>
       </w:r>
     </w:p>
-    <w:tbl>
-      <w:tblPr>
-        <w:tblStyle w:val="TableGrid"/>
-        <w:tblW w:type="auto" w:w="0"/>
+    <w:p>
+      <w:pPr>
         <w:jc w:val="left"/>
-        <w:tblLook w:firstColumn="1" w:firstRow="1" w:lastColumn="0" w:lastRow="0" w:noHBand="0" w:noVBand="1" w:val="04A0"/>
-      </w:tblPr>
-      <w:tblGrid>
-        <w:gridCol w:w="8640"/>
-      </w:tblGrid>
-      <w:tr>
-        <w:tc>
-          <w:tcPr>
-            <w:tcW w:type="dxa" w:w="8640"/>
-            <w:shd w:val="clear" w:fill="F2F3F5"/>
-          </w:tcPr>
-          <w:p>
-            <w:pPr>
-              <w:spacing w:before="0" w:after="0"/>
-            </w:pPr>
-            <w:r/>
-            <w:r>
-              <w:rPr>
-                <w:rFonts w:ascii="Consolas" w:hAnsi="Consolas" w:eastAsia="Consolas"/>
-                <w:sz w:val="17"/>
-              </w:rPr>
-              <w:t xml:space="preserve">  task-service:</w:t>
-            </w:r>
-          </w:p>
-          <w:p>
-            <w:pPr>
-              <w:spacing w:before="0" w:after="0"/>
-            </w:pPr>
-            <w:r>
-              <w:rPr>
-                <w:rFonts w:ascii="Consolas" w:hAnsi="Consolas" w:eastAsia="Consolas"/>
-                <w:sz w:val="17"/>
-              </w:rPr>
-              <w:t xml:space="preserve">    build:</w:t>
-            </w:r>
-          </w:p>
-          <w:p>
-            <w:pPr>
-              <w:spacing w:before="0" w:after="0"/>
-            </w:pPr>
-            <w:r>
-              <w:rPr>
-                <w:rFonts w:ascii="Consolas" w:hAnsi="Consolas" w:eastAsia="Consolas"/>
-                <w:sz w:val="17"/>
-              </w:rPr>
-              <w:t xml:space="preserve">      context: ./backend/task-service</w:t>
-            </w:r>
-          </w:p>
-          <w:p>
-            <w:pPr>
-              <w:spacing w:before="0" w:after="0"/>
-            </w:pPr>
-            <w:r>
-              <w:rPr>
-                <w:rFonts w:ascii="Consolas" w:hAnsi="Consolas" w:eastAsia="Consolas"/>
-                <w:sz w:val="17"/>
-              </w:rPr>
-              <w:t xml:space="preserve">    image: ${IMAGE_REGISTRY}/task-service:${IMAGE_TAG}</w:t>
-            </w:r>
-          </w:p>
-          <w:p>
-            <w:pPr>
-              <w:spacing w:before="0" w:after="0"/>
-            </w:pPr>
-            <w:r>
-              <w:rPr>
-                <w:rFonts w:ascii="Consolas" w:hAnsi="Consolas" w:eastAsia="Consolas"/>
-                <w:sz w:val="17"/>
-              </w:rPr>
-              <w:t xml:space="preserve">    container_name: crm_task_service</w:t>
-            </w:r>
-          </w:p>
-          <w:p>
-            <w:pPr>
-              <w:spacing w:before="0" w:after="0"/>
-            </w:pPr>
-            <w:r>
-              <w:rPr>
-                <w:rFonts w:ascii="Consolas" w:hAnsi="Consolas" w:eastAsia="Consolas"/>
-                <w:sz w:val="17"/>
-              </w:rPr>
-              <w:t xml:space="preserve">    environment:</w:t>
-            </w:r>
-          </w:p>
-          <w:p>
-            <w:pPr>
-              <w:spacing w:before="0" w:after="0"/>
-            </w:pPr>
-            <w:r>
-              <w:rPr>
-                <w:rFonts w:ascii="Consolas" w:hAnsi="Consolas" w:eastAsia="Consolas"/>
-                <w:sz w:val="17"/>
-              </w:rPr>
-              <w:t xml:space="preserve">      SERVER_PORT: 8083</w:t>
-            </w:r>
-          </w:p>
-          <w:p>
-            <w:pPr>
-              <w:spacing w:before="0" w:after="0"/>
-            </w:pPr>
-            <w:r>
-              <w:rPr>
-                <w:rFonts w:ascii="Consolas" w:hAnsi="Consolas" w:eastAsia="Consolas"/>
-                <w:sz w:val="17"/>
-              </w:rPr>
-              <w:t xml:space="preserve">      ZIPKIN_ENDPOINT: http://zipkin:9411/api/v2/spans</w:t>
-            </w:r>
-          </w:p>
-          <w:p>
-            <w:pPr>
-              <w:spacing w:before="0" w:after="0"/>
-            </w:pPr>
-            <w:r>
-              <w:rPr>
-                <w:rFonts w:ascii="Consolas" w:hAnsi="Consolas" w:eastAsia="Consolas"/>
-                <w:sz w:val="17"/>
-              </w:rPr>
-              <w:t xml:space="preserve">      LOKI_URL: http://loki:3100/loki/api/v1/push</w:t>
-            </w:r>
-          </w:p>
-          <w:p>
-            <w:pPr>
-              <w:spacing w:before="0" w:after="0"/>
-            </w:pPr>
-            <w:r>
-              <w:rPr>
-                <w:rFonts w:ascii="Consolas" w:hAnsi="Consolas" w:eastAsia="Consolas"/>
-                <w:sz w:val="17"/>
-              </w:rPr>
-              <w:t xml:space="preserve">      SPRING_DATASOURCE_URL: jdbc:postgresql://postgres:5432/task_db</w:t>
-            </w:r>
-          </w:p>
-          <w:p>
-            <w:pPr>
-              <w:spacing w:before="0" w:after="0"/>
-            </w:pPr>
-            <w:r>
-              <w:rPr>
-                <w:rFonts w:ascii="Consolas" w:hAnsi="Consolas" w:eastAsia="Consolas"/>
-                <w:sz w:val="17"/>
-              </w:rPr>
-              <w:t xml:space="preserve">      SPRING_DATASOURCE_USERNAME: ${POSTGRES_USER}</w:t>
-            </w:r>
-          </w:p>
-          <w:p>
-            <w:pPr>
-              <w:spacing w:before="0" w:after="0"/>
-            </w:pPr>
-            <w:r>
-              <w:rPr>
-                <w:rFonts w:ascii="Consolas" w:hAnsi="Consolas" w:eastAsia="Consolas"/>
-                <w:sz w:val="17"/>
-              </w:rPr>
-              <w:t xml:space="preserve">      SPRING_DATASOURCE_PASSWORD: ${POSTGRES_PASSWORD}</w:t>
-            </w:r>
-          </w:p>
-          <w:p>
-            <w:pPr>
-              <w:spacing w:before="0" w:after="0"/>
-            </w:pPr>
-            <w:r>
-              <w:rPr>
-                <w:rFonts w:ascii="Consolas" w:hAnsi="Consolas" w:eastAsia="Consolas"/>
-                <w:sz w:val="17"/>
-              </w:rPr>
-              <w:t xml:space="preserve">      SPRING_RABBITMQ_HOST: rabbitmq</w:t>
-            </w:r>
-          </w:p>
-          <w:p>
-            <w:pPr>
-              <w:spacing w:before="0" w:after="0"/>
-            </w:pPr>
-            <w:r>
-              <w:rPr>
-                <w:rFonts w:ascii="Consolas" w:hAnsi="Consolas" w:eastAsia="Consolas"/>
-                <w:sz w:val="17"/>
-              </w:rPr>
-              <w:t xml:space="preserve">      SPRING_RABBITMQ_PORT: 5672</w:t>
-            </w:r>
-          </w:p>
-          <w:p>
-            <w:pPr>
-              <w:spacing w:before="0" w:after="0"/>
-            </w:pPr>
-            <w:r>
-              <w:rPr>
-                <w:rFonts w:ascii="Consolas" w:hAnsi="Consolas" w:eastAsia="Consolas"/>
-                <w:sz w:val="17"/>
-              </w:rPr>
-              <w:t xml:space="preserve">      SPRING_RABBITMQ_USERNAME: ${RABBITMQ_USER}</w:t>
-            </w:r>
-          </w:p>
-          <w:p>
-            <w:pPr>
-              <w:spacing w:before="0" w:after="0"/>
-            </w:pPr>
-            <w:r>
-              <w:rPr>
-                <w:rFonts w:ascii="Consolas" w:hAnsi="Consolas" w:eastAsia="Consolas"/>
-                <w:sz w:val="17"/>
-              </w:rPr>
-              <w:t xml:space="preserve">      SPRING_RABBITMQ_PASSWORD: ${RABBITMQ_PASSWORD}</w:t>
-            </w:r>
-          </w:p>
-          <w:p>
-            <w:pPr>
-              <w:spacing w:before="0" w:after="0"/>
-            </w:pPr>
-            <w:r>
-              <w:rPr>
-                <w:rFonts w:ascii="Consolas" w:hAnsi="Consolas" w:eastAsia="Consolas"/>
-                <w:sz w:val="17"/>
-              </w:rPr>
-              <w:t xml:space="preserve">      EMPLOYEE_SERVICE_URL: http://employee-service:8081</w:t>
-            </w:r>
-          </w:p>
-          <w:p>
-            <w:pPr>
-              <w:spacing w:before="0" w:after="0"/>
-            </w:pPr>
-            <w:r>
-              <w:rPr>
-                <w:rFonts w:ascii="Consolas" w:hAnsi="Consolas" w:eastAsia="Consolas"/>
-                <w:sz w:val="17"/>
-              </w:rPr>
-              <w:t xml:space="preserve">    ports:</w:t>
-            </w:r>
-          </w:p>
-          <w:p>
-            <w:pPr>
-              <w:spacing w:before="0" w:after="0"/>
-            </w:pPr>
-            <w:r>
-              <w:rPr>
-                <w:rFonts w:ascii="Consolas" w:hAnsi="Consolas" w:eastAsia="Consolas"/>
-                <w:sz w:val="17"/>
-              </w:rPr>
-              <w:t xml:space="preserve">      - "8083:8083"</w:t>
-            </w:r>
-          </w:p>
-          <w:p>
-            <w:pPr>
-              <w:spacing w:before="0" w:after="0"/>
-            </w:pPr>
-            <w:r>
-              <w:rPr>
-                <w:rFonts w:ascii="Consolas" w:hAnsi="Consolas" w:eastAsia="Consolas"/>
-                <w:sz w:val="17"/>
-              </w:rPr>
-              <w:t xml:space="preserve">    depends_on:</w:t>
-            </w:r>
-          </w:p>
-          <w:p>
-            <w:pPr>
-              <w:spacing w:before="0" w:after="0"/>
-            </w:pPr>
-            <w:r>
-              <w:rPr>
-                <w:rFonts w:ascii="Consolas" w:hAnsi="Consolas" w:eastAsia="Consolas"/>
-                <w:sz w:val="17"/>
-              </w:rPr>
-              <w:t xml:space="preserve">      zipkin:</w:t>
-            </w:r>
-          </w:p>
-          <w:p>
-            <w:pPr>
-              <w:spacing w:before="0" w:after="0"/>
-            </w:pPr>
-            <w:r>
-              <w:rPr>
-                <w:rFonts w:ascii="Consolas" w:hAnsi="Consolas" w:eastAsia="Consolas"/>
-                <w:sz w:val="17"/>
-              </w:rPr>
-              <w:t xml:space="preserve">        condition: service_healthy</w:t>
-            </w:r>
-          </w:p>
-          <w:p>
-            <w:pPr>
-              <w:spacing w:before="0" w:after="0"/>
-            </w:pPr>
-            <w:r>
-              <w:rPr>
-                <w:rFonts w:ascii="Consolas" w:hAnsi="Consolas" w:eastAsia="Consolas"/>
-                <w:sz w:val="17"/>
-              </w:rPr>
-              <w:t xml:space="preserve">      postgres:</w:t>
-            </w:r>
-          </w:p>
-          <w:p>
-            <w:pPr>
-              <w:spacing w:before="0" w:after="0"/>
-            </w:pPr>
-            <w:r>
-              <w:rPr>
-                <w:rFonts w:ascii="Consolas" w:hAnsi="Consolas" w:eastAsia="Consolas"/>
-                <w:sz w:val="17"/>
-              </w:rPr>
-              <w:t xml:space="preserve">        condition: service_healthy</w:t>
-            </w:r>
-          </w:p>
-          <w:p>
-            <w:pPr>
-              <w:spacing w:before="0" w:after="0"/>
-            </w:pPr>
-            <w:r>
-              <w:rPr>
-                <w:rFonts w:ascii="Consolas" w:hAnsi="Consolas" w:eastAsia="Consolas"/>
-                <w:sz w:val="17"/>
-              </w:rPr>
-              <w:t xml:space="preserve">      rabbitmq:</w:t>
-            </w:r>
-          </w:p>
-          <w:p>
-            <w:pPr>
-              <w:spacing w:before="0" w:after="0"/>
-            </w:pPr>
-            <w:r>
-              <w:rPr>
-                <w:rFonts w:ascii="Consolas" w:hAnsi="Consolas" w:eastAsia="Consolas"/>
-                <w:sz w:val="17"/>
-              </w:rPr>
-              <w:t xml:space="preserve">        condition: service_healthy</w:t>
-            </w:r>
-          </w:p>
-          <w:p>
-            <w:pPr>
-              <w:spacing w:before="0" w:after="0"/>
-            </w:pPr>
-            <w:r>
-              <w:rPr>
-                <w:rFonts w:ascii="Consolas" w:hAnsi="Consolas" w:eastAsia="Consolas"/>
-                <w:sz w:val="17"/>
-              </w:rPr>
-              <w:t xml:space="preserve">      employee-service:</w:t>
-            </w:r>
-          </w:p>
-          <w:p>
-            <w:pPr>
-              <w:spacing w:before="0" w:after="0"/>
-            </w:pPr>
-            <w:r>
-              <w:rPr>
-                <w:rFonts w:ascii="Consolas" w:hAnsi="Consolas" w:eastAsia="Consolas"/>
-                <w:sz w:val="17"/>
-              </w:rPr>
-              <w:t xml:space="preserve">        condition: service_healthy</w:t>
-            </w:r>
-          </w:p>
-          <w:p>
-            <w:pPr>
-              <w:spacing w:before="0" w:after="0"/>
-            </w:pPr>
-            <w:r>
-              <w:rPr>
-                <w:rFonts w:ascii="Consolas" w:hAnsi="Consolas" w:eastAsia="Consolas"/>
-                <w:sz w:val="17"/>
-              </w:rPr>
-              <w:t xml:space="preserve">    healthcheck:</w:t>
-            </w:r>
-          </w:p>
-          <w:p>
-            <w:pPr>
-              <w:spacing w:before="0" w:after="0"/>
-            </w:pPr>
-            <w:r>
-              <w:rPr>
-                <w:rFonts w:ascii="Consolas" w:hAnsi="Consolas" w:eastAsia="Consolas"/>
-                <w:sz w:val="17"/>
-              </w:rPr>
-              <w:t xml:space="preserve">      test: ["CMD-SHELL", "curl -f http://localhost:8083/actuator/health || exit 1"]</w:t>
-            </w:r>
-          </w:p>
-          <w:p>
-            <w:pPr>
-              <w:spacing w:before="0" w:after="0"/>
-            </w:pPr>
-            <w:r>
-              <w:rPr>
-                <w:rFonts w:ascii="Consolas" w:hAnsi="Consolas" w:eastAsia="Consolas"/>
-                <w:sz w:val="17"/>
-              </w:rPr>
-              <w:t xml:space="preserve">      interval: 10s</w:t>
-            </w:r>
-          </w:p>
-          <w:p>
-            <w:pPr>
-              <w:spacing w:before="0" w:after="0"/>
-            </w:pPr>
-            <w:r>
-              <w:rPr>
-                <w:rFonts w:ascii="Consolas" w:hAnsi="Consolas" w:eastAsia="Consolas"/>
-                <w:sz w:val="17"/>
-              </w:rPr>
-              <w:t xml:space="preserve">      timeout: 5s</w:t>
-            </w:r>
-          </w:p>
-          <w:p>
-            <w:pPr>
-              <w:spacing w:before="0" w:after="0"/>
-            </w:pPr>
-            <w:r>
-              <w:rPr>
-                <w:rFonts w:ascii="Consolas" w:hAnsi="Consolas" w:eastAsia="Consolas"/>
-                <w:sz w:val="17"/>
-              </w:rPr>
-              <w:t xml:space="preserve">      retries: 12</w:t>
-            </w:r>
-          </w:p>
-          <w:p>
-            <w:pPr>
-              <w:spacing w:before="0" w:after="0"/>
-            </w:pPr>
-            <w:r>
-              <w:rPr>
-                <w:rFonts w:ascii="Consolas" w:hAnsi="Consolas" w:eastAsia="Consolas"/>
-                <w:sz w:val="17"/>
-              </w:rPr>
-              <w:t xml:space="preserve">      start_period: 40s</w:t>
-            </w:r>
-          </w:p>
-          <w:p>
-            <w:pPr>
-              <w:spacing w:before="0" w:after="0"/>
-            </w:pPr>
-            <w:r>
-              <w:rPr>
-                <w:rFonts w:ascii="Consolas" w:hAnsi="Consolas" w:eastAsia="Consolas"/>
-                <w:sz w:val="17"/>
-              </w:rPr>
-              <w:t xml:space="preserve">    networks:</w:t>
-            </w:r>
-          </w:p>
-          <w:p>
-            <w:pPr>
-              <w:spacing w:before="0" w:after="0"/>
-            </w:pPr>
-            <w:r>
-              <w:rPr>
-                <w:rFonts w:ascii="Consolas" w:hAnsi="Consolas" w:eastAsia="Consolas"/>
-                <w:sz w:val="17"/>
-              </w:rPr>
-              <w:t xml:space="preserve">      - crm_network</w:t>
-            </w:r>
-          </w:p>
-        </w:tc>
-      </w:tr>
-    </w:tbl>
+      </w:pPr>
+      <w:r>
+        <w:drawing>
+          <wp:inline xmlns:a="http://schemas.openxmlformats.org/drawingml/2006/main" xmlns:pic="http://schemas.openxmlformats.org/drawingml/2006/picture">
+            <wp:extent cx="5852160" cy="4950048"/>
+            <wp:docPr id="10" name="Picture 10"/>
+            <wp:cNvGraphicFramePr>
+              <a:graphicFrameLocks noChangeAspect="1"/>
+            </wp:cNvGraphicFramePr>
+            <a:graphic>
+              <a:graphicData uri="http://schemas.openxmlformats.org/drawingml/2006/picture">
+                <pic:pic>
+                  <pic:nvPicPr>
+                    <pic:cNvPr id="0" name="snippet_10.png"/>
+                    <pic:cNvPicPr/>
+                  </pic:nvPicPr>
+                  <pic:blipFill>
+                    <a:blip r:embed="rId18"/>
+                    <a:stretch>
+                      <a:fillRect/>
+                    </a:stretch>
+                  </pic:blipFill>
+                  <pic:spPr>
+                    <a:xfrm>
+                      <a:off x="0" y="0"/>
+                      <a:ext cx="5852160" cy="4950048"/>
+                    </a:xfrm>
+                    <a:prstGeom prst="rect"/>
+                  </pic:spPr>
+                </pic:pic>
+              </a:graphicData>
+            </a:graphic>
+          </wp:inline>
+        </w:drawing>
+      </w:r>
+    </w:p>
     <w:p/>
     <w:p>
       <w:pPr>
@@ -5095,98 +3281,45 @@
         <w:t>Analiza pokriva code smells, potencijalne bugove i sigurnosne probleme. Quality gate obara build ako nije zadovoljen. Taj flag je namerno ukljucen tek kada je kod bio cist, da ne bi blokirao rad tokom razvoja.</w:t>
       </w:r>
     </w:p>
-    <w:tbl>
-      <w:tblPr>
-        <w:tblStyle w:val="TableGrid"/>
-        <w:tblW w:type="auto" w:w="0"/>
+    <w:p>
+      <w:pPr>
         <w:jc w:val="left"/>
-        <w:tblLook w:firstColumn="1" w:firstRow="1" w:lastColumn="0" w:lastRow="0" w:noHBand="0" w:noVBand="1" w:val="04A0"/>
-      </w:tblPr>
-      <w:tblGrid>
-        <w:gridCol w:w="8640"/>
-      </w:tblGrid>
-      <w:tr>
-        <w:tc>
-          <w:tcPr>
-            <w:tcW w:type="dxa" w:w="8640"/>
-            <w:shd w:val="clear" w:fill="F2F3F5"/>
-          </w:tcPr>
-          <w:p>
-            <w:pPr>
-              <w:spacing w:before="0" w:after="0"/>
-            </w:pPr>
-            <w:r/>
-            <w:r>
-              <w:rPr>
-                <w:rFonts w:ascii="Consolas" w:hAnsi="Consolas" w:eastAsia="Consolas"/>
-                <w:sz w:val="17"/>
-              </w:rPr>
-              <w:t xml:space="preserve">      - name: SonarCloud Scan</w:t>
-            </w:r>
-          </w:p>
-          <w:p>
-            <w:pPr>
-              <w:spacing w:before="0" w:after="0"/>
-            </w:pPr>
-            <w:r>
-              <w:rPr>
-                <w:rFonts w:ascii="Consolas" w:hAnsi="Consolas" w:eastAsia="Consolas"/>
-                <w:sz w:val="17"/>
-              </w:rPr>
-              <w:t xml:space="preserve">        if: github.event_name == 'pull_request' || github.ref == 'refs/heads/main'</w:t>
-            </w:r>
-          </w:p>
-          <w:p>
-            <w:pPr>
-              <w:spacing w:before="0" w:after="0"/>
-            </w:pPr>
-            <w:r>
-              <w:rPr>
-                <w:rFonts w:ascii="Consolas" w:hAnsi="Consolas" w:eastAsia="Consolas"/>
-                <w:sz w:val="17"/>
-              </w:rPr>
-              <w:t xml:space="preserve">        env:</w:t>
-            </w:r>
-          </w:p>
-          <w:p>
-            <w:pPr>
-              <w:spacing w:before="0" w:after="0"/>
-            </w:pPr>
-            <w:r>
-              <w:rPr>
-                <w:rFonts w:ascii="Consolas" w:hAnsi="Consolas" w:eastAsia="Consolas"/>
-                <w:sz w:val="17"/>
-              </w:rPr>
-              <w:t xml:space="preserve">          GITHUB_TOKEN: ${{ secrets.GITHUB_TOKEN }}</w:t>
-            </w:r>
-          </w:p>
-          <w:p>
-            <w:pPr>
-              <w:spacing w:before="0" w:after="0"/>
-            </w:pPr>
-            <w:r>
-              <w:rPr>
-                <w:rFonts w:ascii="Consolas" w:hAnsi="Consolas" w:eastAsia="Consolas"/>
-                <w:sz w:val="17"/>
-              </w:rPr>
-              <w:t xml:space="preserve">          SONAR_TOKEN: ${{ secrets.SONAR_TOKEN }}</w:t>
-            </w:r>
-          </w:p>
-          <w:p>
-            <w:pPr>
-              <w:spacing w:before="0" w:after="0"/>
-            </w:pPr>
-            <w:r>
-              <w:rPr>
-                <w:rFonts w:ascii="Consolas" w:hAnsi="Consolas" w:eastAsia="Consolas"/>
-                <w:sz w:val="17"/>
-              </w:rPr>
-              <w:t xml:space="preserve">        run: mvn -B -f backend/pom.xml org.sonarsource.scanner.maven:sonar-maven-plugin:5.7.0.6970:sonar -Dsonar.qualitygate.wait=true</w:t>
-            </w:r>
-          </w:p>
-        </w:tc>
-      </w:tr>
-    </w:tbl>
+      </w:pPr>
+      <w:r>
+        <w:drawing>
+          <wp:inline xmlns:a="http://schemas.openxmlformats.org/drawingml/2006/main" xmlns:pic="http://schemas.openxmlformats.org/drawingml/2006/picture">
+            <wp:extent cx="5852160" cy="621137"/>
+            <wp:docPr id="11" name="Picture 11"/>
+            <wp:cNvGraphicFramePr>
+              <a:graphicFrameLocks noChangeAspect="1"/>
+            </wp:cNvGraphicFramePr>
+            <a:graphic>
+              <a:graphicData uri="http://schemas.openxmlformats.org/drawingml/2006/picture">
+                <pic:pic>
+                  <pic:nvPicPr>
+                    <pic:cNvPr id="0" name="snippet_11.png"/>
+                    <pic:cNvPicPr/>
+                  </pic:nvPicPr>
+                  <pic:blipFill>
+                    <a:blip r:embed="rId19"/>
+                    <a:stretch>
+                      <a:fillRect/>
+                    </a:stretch>
+                  </pic:blipFill>
+                  <pic:spPr>
+                    <a:xfrm>
+                      <a:off x="0" y="0"/>
+                      <a:ext cx="5852160" cy="621137"/>
+                    </a:xfrm>
+                    <a:prstGeom prst="rect"/>
+                  </pic:spPr>
+                </pic:pic>
+              </a:graphicData>
+            </a:graphic>
+          </wp:inline>
+        </w:drawing>
+      </w:r>
+    </w:p>
     <w:p/>
     <w:p>
       <w:pPr>
@@ -5284,242 +3417,45 @@
         <w:t>, zatim proverava health endpoint svakog od pet servisa i rutiranje kroz gateway. Provere imaju retry mehanizam, jer mapiranje portova ume da zakasni za kontejnerom. Skripta vraca neuspeh ako bilo koja provera ne prodje.</w:t>
       </w:r>
     </w:p>
-    <w:tbl>
-      <w:tblPr>
-        <w:tblStyle w:val="TableGrid"/>
-        <w:tblW w:type="auto" w:w="0"/>
+    <w:p>
+      <w:pPr>
         <w:jc w:val="left"/>
-        <w:tblLook w:firstColumn="1" w:firstRow="1" w:lastColumn="0" w:lastRow="0" w:noHBand="0" w:noVBand="1" w:val="04A0"/>
-      </w:tblPr>
-      <w:tblGrid>
-        <w:gridCol w:w="8640"/>
-      </w:tblGrid>
-      <w:tr>
-        <w:tc>
-          <w:tcPr>
-            <w:tcW w:type="dxa" w:w="8640"/>
-            <w:shd w:val="clear" w:fill="F2F3F5"/>
-          </w:tcPr>
-          <w:p>
-            <w:pPr>
-              <w:spacing w:before="0" w:after="0"/>
-            </w:pPr>
-            <w:r/>
-            <w:r>
-              <w:rPr>
-                <w:rFonts w:ascii="Consolas" w:hAnsi="Consolas" w:eastAsia="Consolas"/>
-                <w:sz w:val="17"/>
-              </w:rPr>
-              <w:t>echo "Pokrecem post-deploy health check..."</w:t>
-            </w:r>
-          </w:p>
-          <w:p>
-            <w:pPr>
-              <w:spacing w:before="0" w:after="0"/>
-            </w:pPr>
-            <w:r>
-              <w:rPr>
-                <w:rFonts w:ascii="Consolas" w:hAnsi="Consolas" w:eastAsia="Consolas"/>
-                <w:sz w:val="17"/>
-              </w:rPr>
-              <w:t>failed=0</w:t>
-            </w:r>
-          </w:p>
-          <w:p>
-            <w:pPr>
-              <w:spacing w:before="0" w:after="0"/>
-            </w:pPr>
-            <w:r>
-              <w:rPr>
-                <w:rFonts w:ascii="Consolas" w:hAnsi="Consolas" w:eastAsia="Consolas"/>
-                <w:sz w:val="17"/>
-              </w:rPr>
-              <w:t>for entry in api-gateway:8080 employee-service:8081 client-service:8082 task-service:8083 notification-service:8084; do</w:t>
-            </w:r>
-          </w:p>
-          <w:p>
-            <w:pPr>
-              <w:spacing w:before="0" w:after="0"/>
-            </w:pPr>
-            <w:r>
-              <w:rPr>
-                <w:rFonts w:ascii="Consolas" w:hAnsi="Consolas" w:eastAsia="Consolas"/>
-                <w:sz w:val="17"/>
-              </w:rPr>
-              <w:t xml:space="preserve">    name=${entry%%:*}</w:t>
-            </w:r>
-          </w:p>
-          <w:p>
-            <w:pPr>
-              <w:spacing w:before="0" w:after="0"/>
-            </w:pPr>
-            <w:r>
-              <w:rPr>
-                <w:rFonts w:ascii="Consolas" w:hAnsi="Consolas" w:eastAsia="Consolas"/>
-                <w:sz w:val="17"/>
-              </w:rPr>
-              <w:t xml:space="preserve">    port=${entry##*:}</w:t>
-            </w:r>
-          </w:p>
-          <w:p>
-            <w:pPr>
-              <w:spacing w:before="0" w:after="0"/>
-            </w:pPr>
-            <w:r>
-              <w:rPr>
-                <w:rFonts w:ascii="Consolas" w:hAnsi="Consolas" w:eastAsia="Consolas"/>
-                <w:sz w:val="17"/>
-              </w:rPr>
-              <w:t xml:space="preserve">    if wait_for_ok "http://localhost:${port}/actuator/health"; then</w:t>
-            </w:r>
-          </w:p>
-          <w:p>
-            <w:pPr>
-              <w:spacing w:before="0" w:after="0"/>
-            </w:pPr>
-            <w:r>
-              <w:rPr>
-                <w:rFonts w:ascii="Consolas" w:hAnsi="Consolas" w:eastAsia="Consolas"/>
-                <w:sz w:val="17"/>
-              </w:rPr>
-              <w:t xml:space="preserve">        echo "  ${name} je zdrav"</w:t>
-            </w:r>
-          </w:p>
-          <w:p>
-            <w:pPr>
-              <w:spacing w:before="0" w:after="0"/>
-            </w:pPr>
-            <w:r>
-              <w:rPr>
-                <w:rFonts w:ascii="Consolas" w:hAnsi="Consolas" w:eastAsia="Consolas"/>
-                <w:sz w:val="17"/>
-              </w:rPr>
-              <w:t xml:space="preserve">    else</w:t>
-            </w:r>
-          </w:p>
-          <w:p>
-            <w:pPr>
-              <w:spacing w:before="0" w:after="0"/>
-            </w:pPr>
-            <w:r>
-              <w:rPr>
-                <w:rFonts w:ascii="Consolas" w:hAnsi="Consolas" w:eastAsia="Consolas"/>
-                <w:sz w:val="17"/>
-              </w:rPr>
-              <w:t xml:space="preserve">        echo "  ${name} nije zdrav (poslednji odgovor: $(http_status "http://localhost:${port}/actuator/health"))"</w:t>
-            </w:r>
-          </w:p>
-          <w:p>
-            <w:pPr>
-              <w:spacing w:before="0" w:after="0"/>
-            </w:pPr>
-            <w:r>
-              <w:rPr>
-                <w:rFonts w:ascii="Consolas" w:hAnsi="Consolas" w:eastAsia="Consolas"/>
-                <w:sz w:val="17"/>
-              </w:rPr>
-              <w:t xml:space="preserve">        failed=1</w:t>
-            </w:r>
-          </w:p>
-          <w:p>
-            <w:pPr>
-              <w:spacing w:before="0" w:after="0"/>
-            </w:pPr>
-            <w:r>
-              <w:rPr>
-                <w:rFonts w:ascii="Consolas" w:hAnsi="Consolas" w:eastAsia="Consolas"/>
-                <w:sz w:val="17"/>
-              </w:rPr>
-              <w:t xml:space="preserve">    fi</w:t>
-            </w:r>
-          </w:p>
-          <w:p>
-            <w:pPr>
-              <w:spacing w:before="0" w:after="0"/>
-            </w:pPr>
-            <w:r>
-              <w:rPr>
-                <w:rFonts w:ascii="Consolas" w:hAnsi="Consolas" w:eastAsia="Consolas"/>
-                <w:sz w:val="17"/>
-              </w:rPr>
-              <w:t>done</w:t>
-            </w:r>
-          </w:p>
-          <w:p>
-            <w:pPr>
-              <w:spacing w:before="0" w:after="0"/>
-            </w:pPr>
-            <w:r>
-              <w:rPr>
-                <w:rFonts w:ascii="Consolas" w:hAnsi="Consolas" w:eastAsia="Consolas"/>
-                <w:sz w:val="17"/>
-              </w:rPr>
-              <w:t xml:space="preserve"> </w:t>
-            </w:r>
-          </w:p>
-          <w:p>
-            <w:pPr>
-              <w:spacing w:before="0" w:after="0"/>
-            </w:pPr>
-            <w:r>
-              <w:rPr>
-                <w:rFonts w:ascii="Consolas" w:hAnsi="Consolas" w:eastAsia="Consolas"/>
-                <w:sz w:val="17"/>
-              </w:rPr>
-              <w:t>if [ "$failed" -ne 0 ]; then</w:t>
-            </w:r>
-          </w:p>
-          <w:p>
-            <w:pPr>
-              <w:spacing w:before="0" w:after="0"/>
-            </w:pPr>
-            <w:r>
-              <w:rPr>
-                <w:rFonts w:ascii="Consolas" w:hAnsi="Consolas" w:eastAsia="Consolas"/>
-                <w:sz w:val="17"/>
-              </w:rPr>
-              <w:t xml:space="preserve">    echo "Deploy nije uspeo, bar jedan servis nije zdrav."</w:t>
-            </w:r>
-          </w:p>
-          <w:p>
-            <w:pPr>
-              <w:spacing w:before="0" w:after="0"/>
-            </w:pPr>
-            <w:r>
-              <w:rPr>
-                <w:rFonts w:ascii="Consolas" w:hAnsi="Consolas" w:eastAsia="Consolas"/>
-                <w:sz w:val="17"/>
-              </w:rPr>
-              <w:t xml:space="preserve">    docker compose ps</w:t>
-            </w:r>
-          </w:p>
-          <w:p>
-            <w:pPr>
-              <w:spacing w:before="0" w:after="0"/>
-            </w:pPr>
-            <w:r>
-              <w:rPr>
-                <w:rFonts w:ascii="Consolas" w:hAnsi="Consolas" w:eastAsia="Consolas"/>
-                <w:sz w:val="17"/>
-              </w:rPr>
-              <w:t xml:space="preserve">    exit 1</w:t>
-            </w:r>
-          </w:p>
-          <w:p>
-            <w:pPr>
-              <w:spacing w:before="0" w:after="0"/>
-            </w:pPr>
-            <w:r>
-              <w:rPr>
-                <w:rFonts w:ascii="Consolas" w:hAnsi="Consolas" w:eastAsia="Consolas"/>
-                <w:sz w:val="17"/>
-              </w:rPr>
-              <w:t>fi</w:t>
-            </w:r>
-          </w:p>
-        </w:tc>
-      </w:tr>
-    </w:tbl>
+      </w:pPr>
+      <w:r>
+        <w:drawing>
+          <wp:inline xmlns:a="http://schemas.openxmlformats.org/drawingml/2006/main" xmlns:pic="http://schemas.openxmlformats.org/drawingml/2006/picture">
+            <wp:extent cx="5852160" cy="1776549"/>
+            <wp:docPr id="12" name="Picture 12"/>
+            <wp:cNvGraphicFramePr>
+              <a:graphicFrameLocks noChangeAspect="1"/>
+            </wp:cNvGraphicFramePr>
+            <a:graphic>
+              <a:graphicData uri="http://schemas.openxmlformats.org/drawingml/2006/picture">
+                <pic:pic>
+                  <pic:nvPicPr>
+                    <pic:cNvPr id="0" name="snippet_12.png"/>
+                    <pic:cNvPicPr/>
+                  </pic:nvPicPr>
+                  <pic:blipFill>
+                    <a:blip r:embed="rId20"/>
+                    <a:stretch>
+                      <a:fillRect/>
+                    </a:stretch>
+                  </pic:blipFill>
+                  <pic:spPr>
+                    <a:xfrm>
+                      <a:off x="0" y="0"/>
+                      <a:ext cx="5852160" cy="1776549"/>
+                    </a:xfrm>
+                    <a:prstGeom prst="rect"/>
+                  </pic:spPr>
+                </pic:pic>
+              </a:graphicData>
+            </a:graphic>
+          </wp:inline>
+        </w:drawing>
+      </w:r>
+    </w:p>
     <w:p/>
     <w:p>
       <w:pPr>
@@ -5582,98 +3518,45 @@
         <w:t xml:space="preserve"> i sa SHA commit-a.</w:t>
       </w:r>
     </w:p>
-    <w:tbl>
-      <w:tblPr>
-        <w:tblStyle w:val="TableGrid"/>
-        <w:tblW w:type="auto" w:w="0"/>
+    <w:p>
+      <w:pPr>
         <w:jc w:val="left"/>
-        <w:tblLook w:firstColumn="1" w:firstRow="1" w:lastColumn="0" w:lastRow="0" w:noHBand="0" w:noVBand="1" w:val="04A0"/>
-      </w:tblPr>
-      <w:tblGrid>
-        <w:gridCol w:w="8640"/>
-      </w:tblGrid>
-      <w:tr>
-        <w:tc>
-          <w:tcPr>
-            <w:tcW w:type="dxa" w:w="8640"/>
-            <w:shd w:val="clear" w:fill="F2F3F5"/>
-          </w:tcPr>
-          <w:p>
-            <w:pPr>
-              <w:spacing w:before="0" w:after="0"/>
-            </w:pPr>
-            <w:r/>
-            <w:r>
-              <w:rPr>
-                <w:rFonts w:ascii="Consolas" w:hAnsi="Consolas" w:eastAsia="Consolas"/>
-                <w:sz w:val="17"/>
-              </w:rPr>
-              <w:t xml:space="preserve">      - name: Build i push (${{ matrix.service }})</w:t>
-            </w:r>
-          </w:p>
-          <w:p>
-            <w:pPr>
-              <w:spacing w:before="0" w:after="0"/>
-            </w:pPr>
-            <w:r>
-              <w:rPr>
-                <w:rFonts w:ascii="Consolas" w:hAnsi="Consolas" w:eastAsia="Consolas"/>
-                <w:sz w:val="17"/>
-              </w:rPr>
-              <w:t xml:space="preserve">        run: |</w:t>
-            </w:r>
-          </w:p>
-          <w:p>
-            <w:pPr>
-              <w:spacing w:before="0" w:after="0"/>
-            </w:pPr>
-            <w:r>
-              <w:rPr>
-                <w:rFonts w:ascii="Consolas" w:hAnsi="Consolas" w:eastAsia="Consolas"/>
-                <w:sz w:val="17"/>
-              </w:rPr>
-              <w:t xml:space="preserve">          IMAGE_ID=$(echo "ghcr.io/${{ github.repository_owner }}/${{ matrix.service }}" | tr '[:upper:]' '[:lower:]')</w:t>
-            </w:r>
-          </w:p>
-          <w:p>
-            <w:pPr>
-              <w:spacing w:before="0" w:after="0"/>
-            </w:pPr>
-            <w:r>
-              <w:rPr>
-                <w:rFonts w:ascii="Consolas" w:hAnsi="Consolas" w:eastAsia="Consolas"/>
-                <w:sz w:val="17"/>
-              </w:rPr>
-              <w:t xml:space="preserve">          docker build -t "$IMAGE_ID:latest" -t "$IMAGE_ID:${{ github.sha }}" "backend/${{ matrix.service }}"</w:t>
-            </w:r>
-          </w:p>
-          <w:p>
-            <w:pPr>
-              <w:spacing w:before="0" w:after="0"/>
-            </w:pPr>
-            <w:r>
-              <w:rPr>
-                <w:rFonts w:ascii="Consolas" w:hAnsi="Consolas" w:eastAsia="Consolas"/>
-                <w:sz w:val="17"/>
-              </w:rPr>
-              <w:t xml:space="preserve">          docker push "$IMAGE_ID:latest"</w:t>
-            </w:r>
-          </w:p>
-          <w:p>
-            <w:pPr>
-              <w:spacing w:before="0" w:after="0"/>
-            </w:pPr>
-            <w:r>
-              <w:rPr>
-                <w:rFonts w:ascii="Consolas" w:hAnsi="Consolas" w:eastAsia="Consolas"/>
-                <w:sz w:val="17"/>
-              </w:rPr>
-              <w:t xml:space="preserve">          docker push "$IMAGE_ID:${{ github.sha }}"</w:t>
-            </w:r>
-          </w:p>
-        </w:tc>
-      </w:tr>
-    </w:tbl>
+      </w:pPr>
+      <w:r>
+        <w:drawing>
+          <wp:inline xmlns:a="http://schemas.openxmlformats.org/drawingml/2006/main" xmlns:pic="http://schemas.openxmlformats.org/drawingml/2006/picture">
+            <wp:extent cx="5852160" cy="708060"/>
+            <wp:docPr id="13" name="Picture 13"/>
+            <wp:cNvGraphicFramePr>
+              <a:graphicFrameLocks noChangeAspect="1"/>
+            </wp:cNvGraphicFramePr>
+            <a:graphic>
+              <a:graphicData uri="http://schemas.openxmlformats.org/drawingml/2006/picture">
+                <pic:pic>
+                  <pic:nvPicPr>
+                    <pic:cNvPr id="0" name="snippet_13.png"/>
+                    <pic:cNvPicPr/>
+                  </pic:nvPicPr>
+                  <pic:blipFill>
+                    <a:blip r:embed="rId21"/>
+                    <a:stretch>
+                      <a:fillRect/>
+                    </a:stretch>
+                  </pic:blipFill>
+                  <pic:spPr>
+                    <a:xfrm>
+                      <a:off x="0" y="0"/>
+                      <a:ext cx="5852160" cy="708060"/>
+                    </a:xfrm>
+                    <a:prstGeom prst="rect"/>
+                  </pic:spPr>
+                </pic:pic>
+              </a:graphicData>
+            </a:graphic>
+          </wp:inline>
+        </w:drawing>
+      </w:r>
+    </w:p>
     <w:p/>
     <w:p>
       <w:pPr>
@@ -5944,38 +3827,45 @@
         <w:t xml:space="preserve"> serijom ne bi vracao nista.</w:t>
       </w:r>
     </w:p>
-    <w:tbl>
-      <w:tblPr>
-        <w:tblStyle w:val="TableGrid"/>
-        <w:tblW w:type="auto" w:w="0"/>
+    <w:p>
+      <w:pPr>
         <w:jc w:val="left"/>
-        <w:tblLook w:firstColumn="1" w:firstRow="1" w:lastColumn="0" w:lastRow="0" w:noHBand="0" w:noVBand="1" w:val="04A0"/>
-      </w:tblPr>
-      <w:tblGrid>
-        <w:gridCol w:w="8640"/>
-      </w:tblGrid>
-      <w:tr>
-        <w:tc>
-          <w:tcPr>
-            <w:tcW w:type="dxa" w:w="8640"/>
-            <w:shd w:val="clear" w:fill="F2F3F5"/>
-          </w:tcPr>
-          <w:p>
-            <w:pPr>
-              <w:spacing w:before="0" w:after="0"/>
-            </w:pPr>
-            <w:r/>
-            <w:r>
-              <w:rPr>
-                <w:rFonts w:ascii="Consolas" w:hAnsi="Consolas" w:eastAsia="Consolas"/>
-                <w:sz w:val="17"/>
-              </w:rPr>
-              <w:t>management.metrics.distribution.percentiles-histogram.http.server.requests=true</w:t>
-            </w:r>
-          </w:p>
-        </w:tc>
-      </w:tr>
-    </w:tbl>
+      </w:pPr>
+      <w:r>
+        <w:drawing>
+          <wp:inline xmlns:a="http://schemas.openxmlformats.org/drawingml/2006/main" xmlns:pic="http://schemas.openxmlformats.org/drawingml/2006/picture">
+            <wp:extent cx="5852160" cy="305799"/>
+            <wp:docPr id="14" name="Picture 14"/>
+            <wp:cNvGraphicFramePr>
+              <a:graphicFrameLocks noChangeAspect="1"/>
+            </wp:cNvGraphicFramePr>
+            <a:graphic>
+              <a:graphicData uri="http://schemas.openxmlformats.org/drawingml/2006/picture">
+                <pic:pic>
+                  <pic:nvPicPr>
+                    <pic:cNvPr id="0" name="snippet_14.png"/>
+                    <pic:cNvPicPr/>
+                  </pic:nvPicPr>
+                  <pic:blipFill>
+                    <a:blip r:embed="rId22"/>
+                    <a:stretch>
+                      <a:fillRect/>
+                    </a:stretch>
+                  </pic:blipFill>
+                  <pic:spPr>
+                    <a:xfrm>
+                      <a:off x="0" y="0"/>
+                      <a:ext cx="5852160" cy="305799"/>
+                    </a:xfrm>
+                    <a:prstGeom prst="rect"/>
+                  </pic:spPr>
+                </pic:pic>
+              </a:graphicData>
+            </a:graphic>
+          </wp:inline>
+        </w:drawing>
+      </w:r>
+    </w:p>
     <w:p/>
     <w:p>
       <w:pPr>
@@ -5985,7 +3875,7 @@
         <w:drawing>
           <wp:inline xmlns:a="http://schemas.openxmlformats.org/drawingml/2006/main" xmlns:pic="http://schemas.openxmlformats.org/drawingml/2006/picture">
             <wp:extent cx="5760720" cy="4416552"/>
-            <wp:docPr id="1" name="Picture 1"/>
+            <wp:docPr id="15" name="Picture 15"/>
             <wp:cNvGraphicFramePr>
               <a:graphicFrameLocks noChangeAspect="1"/>
             </wp:cNvGraphicFramePr>
@@ -5997,7 +3887,7 @@
                     <pic:cNvPicPr/>
                   </pic:nvPicPr>
                   <pic:blipFill>
-                    <a:blip r:embed="rId9"/>
+                    <a:blip r:embed="rId23"/>
                     <a:stretch>
                       <a:fillRect/>
                     </a:stretch>
@@ -8696,7 +6586,7 @@
         <w:drawing>
           <wp:inline xmlns:a="http://schemas.openxmlformats.org/drawingml/2006/main" xmlns:pic="http://schemas.openxmlformats.org/drawingml/2006/picture">
             <wp:extent cx="5760720" cy="2295287"/>
-            <wp:docPr id="2" name="Picture 2"/>
+            <wp:docPr id="16" name="Picture 16"/>
             <wp:cNvGraphicFramePr>
               <a:graphicFrameLocks noChangeAspect="1"/>
             </wp:cNvGraphicFramePr>
@@ -8708,7 +6598,7 @@
                     <pic:cNvPicPr/>
                   </pic:nvPicPr>
                   <pic:blipFill>
-                    <a:blip r:embed="rId10"/>
+                    <a:blip r:embed="rId24"/>
                     <a:stretch>
                       <a:fillRect/>
                     </a:stretch>
@@ -8748,7 +6638,7 @@
         <w:drawing>
           <wp:inline xmlns:a="http://schemas.openxmlformats.org/drawingml/2006/main" xmlns:pic="http://schemas.openxmlformats.org/drawingml/2006/picture">
             <wp:extent cx="5760720" cy="1914609"/>
-            <wp:docPr id="3" name="Picture 3"/>
+            <wp:docPr id="17" name="Picture 17"/>
             <wp:cNvGraphicFramePr>
               <a:graphicFrameLocks noChangeAspect="1"/>
             </wp:cNvGraphicFramePr>
@@ -8760,7 +6650,7 @@
                     <pic:cNvPicPr/>
                   </pic:nvPicPr>
                   <pic:blipFill>
-                    <a:blip r:embed="rId11"/>
+                    <a:blip r:embed="rId25"/>
                     <a:stretch>
                       <a:fillRect/>
                     </a:stretch>
@@ -8800,7 +6690,7 @@
         <w:drawing>
           <wp:inline xmlns:a="http://schemas.openxmlformats.org/drawingml/2006/main" xmlns:pic="http://schemas.openxmlformats.org/drawingml/2006/picture">
             <wp:extent cx="5760720" cy="2480935"/>
-            <wp:docPr id="4" name="Picture 4"/>
+            <wp:docPr id="18" name="Picture 18"/>
             <wp:cNvGraphicFramePr>
               <a:graphicFrameLocks noChangeAspect="1"/>
             </wp:cNvGraphicFramePr>
@@ -8812,7 +6702,7 @@
                     <pic:cNvPicPr/>
                   </pic:nvPicPr>
                   <pic:blipFill>
-                    <a:blip r:embed="rId12"/>
+                    <a:blip r:embed="rId26"/>
                     <a:stretch>
                       <a:fillRect/>
                     </a:stretch>

</xml_diff>

<commit_message>
docs: update documentation and add PDF version
</commit_message>
<xml_diff>
--- a/DOKUMENTACIJA.docx
+++ b/DOKUMENTACIJA.docx
@@ -39,6 +39,61 @@
       </w:r>
     </w:p>
     <w:p/>
+    <w:p/>
+    <w:p>
+      <w:pPr>
+        <w:spacing w:after="200"/>
+        <w:jc w:val="center"/>
+      </w:pPr>
+      <w:r>
+        <w:rPr>
+          <w:color w:val="444A55"/>
+          <w:sz w:val="24"/>
+        </w:rPr>
+        <w:t xml:space="preserve">Integracija razvoja i operative u informacionim tehnologijama</w:t>
+      </w:r>
+    </w:p>
+    <w:p>
+      <w:pPr>
+        <w:spacing w:after="40"/>
+        <w:jc w:val="center"/>
+      </w:pPr>
+      <w:r>
+        <w:rPr>
+          <w:b/>
+          <w:color w:val="1F3B73"/>
+          <w:sz w:val="26"/>
+        </w:rPr>
+        <w:t xml:space="preserve">Luka Davidović</w:t>
+      </w:r>
+    </w:p>
+    <w:p>
+      <w:pPr>
+        <w:spacing w:after="200"/>
+        <w:jc w:val="center"/>
+      </w:pPr>
+      <w:r>
+        <w:rPr>
+          <w:color w:val="444A55"/>
+          <w:sz w:val="22"/>
+        </w:rPr>
+        <w:t xml:space="preserve">Broj indeksa: IT51-2022</w:t>
+      </w:r>
+    </w:p>
+    <w:p>
+      <w:pPr>
+        <w:spacing w:after="0"/>
+        <w:jc w:val="center"/>
+      </w:pPr>
+      <w:r>
+        <w:rPr>
+          <w:color w:val="666666"/>
+          <w:sz w:val="21"/>
+        </w:rPr>
+        <w:t xml:space="preserve">Avgust 2026.</w:t>
+      </w:r>
+    </w:p>
+    <w:p/>
     <w:p>
       <w:pPr>
         <w:pStyle w:val="Heading1"/>
@@ -47,7 +102,7 @@
         <w:rPr>
           <w:color w:val="1F3B73"/>
         </w:rPr>
-        <w:t>Sadrzaj</w:t>
+        <w:t>Sadržaj</w:t>
       </w:r>
     </w:p>
     <w:p>
@@ -69,7 +124,7 @@
         <w:rPr>
           <w:sz w:val="22"/>
         </w:rPr>
-        <w:t>2.  Tehnologije i obrazlozenje izbora</w:t>
+        <w:t>2.  Tehnologije i obrazloženje izbora</w:t>
       </w:r>
     </w:p>
     <w:p>
@@ -80,7 +135,7 @@
         <w:rPr>
           <w:sz w:val="22"/>
         </w:rPr>
-        <w:t>3.  Ispunjenost zahteva po tackama specifikacije</w:t>
+        <w:t>3.  Ispunjenost zahteva po tačkama specifikacije</w:t>
       </w:r>
     </w:p>
     <w:p>
@@ -449,7 +504,7 @@
           <w:color w:val="555A64"/>
           <w:sz w:val="17"/>
         </w:rPr>
-        <w:t>Arhitektura sistema. Gateway je jedina ulazna tacka, svaki servis ima svoju bazu.</w:t>
+        <w:t>Arhitektura sistema. Gateway je jedina ulazna tačka, svaki servis ima svoju bazu.</w:t>
       </w:r>
     </w:p>
     <w:p>
@@ -460,7 +515,7 @@
         <w:rPr>
           <w:color w:val="1F3B73"/>
         </w:rPr>
-        <w:t>Kljucne arhitektonske odluke</w:t>
+        <w:t>Ključne arhitektonske odluke</w:t>
       </w:r>
     </w:p>
     <w:p>
@@ -472,7 +527,7 @@
           <w:b/>
           <w:sz w:val="21"/>
         </w:rPr>
-        <w:t xml:space="preserve">Gateway kao jedina ulazna tacka. </w:t>
+        <w:t xml:space="preserve">Gateway kao jedina ulazna tačka. </w:t>
       </w:r>
       <w:r>
         <w:rPr>
@@ -548,7 +603,7 @@
         <w:rPr>
           <w:sz w:val="21"/>
         </w:rPr>
-        <w:t xml:space="preserve">Umesto jedne deljene seme, svaki servis ima svoju bazu unutar iste PostgreSQL instance. Baze se kreiraju automatski, init skriptom montiranom u </w:t>
+        <w:t xml:space="preserve">Umesto jedne deljene šeme, svaki servis ima svoju bazu unutar iste PostgreSQL instance. Baze se kreiraju automatski, init skriptom montiranom u </w:t>
       </w:r>
       <w:r>
         <w:rPr>
@@ -561,7 +616,7 @@
         <w:rPr>
           <w:sz w:val="21"/>
         </w:rPr>
-        <w:t>. Nijedan servis ne cita tudje tabele, komunikacija ide iskljucivo kroz REST ili poruke.</w:t>
+        <w:t>. Nijedan servis ne čita tuđe tabele, komunikacija ide isključivo kroz REST ili poruke.</w:t>
       </w:r>
     </w:p>
     <w:p>
@@ -679,7 +734,7 @@
         <w:rPr>
           <w:sz w:val="21"/>
         </w:rPr>
-        <w:t xml:space="preserve">Klijent salje </w:t>
+        <w:t xml:space="preserve">Klijent šalje </w:t>
       </w:r>
       <w:r>
         <w:rPr>
@@ -828,7 +883,7 @@
         <w:rPr>
           <w:sz w:val="21"/>
         </w:rPr>
-        <w:t xml:space="preserve"> dogadjaj na RabbitMQ topic exchange.</w:t>
+        <w:t xml:space="preserve"> događaj na RabbitMQ topic exchange.</w:t>
       </w:r>
     </w:p>
     <w:p>
@@ -852,7 +907,7 @@
         <w:rPr>
           <w:sz w:val="21"/>
         </w:rPr>
-        <w:t xml:space="preserve"> asinhrono konzumira dogadjaj, upisuje notifikaciju u svoju bazu i loguje je.</w:t>
+        <w:t xml:space="preserve"> asinhrono konzumira događaj, upisuje notifikaciju u svoju bazu i loguje je.</w:t>
       </w:r>
     </w:p>
     <w:p>
@@ -863,7 +918,7 @@
         <w:rPr>
           <w:sz w:val="21"/>
         </w:rPr>
-        <w:t>Ceo lanac je vidljiv kao jedan trace u Zipkin-u, ukljucujuci i skok kroz broker.</w:t>
+        <w:t>Ceo lanac je vidljiv kao jedan trace u Zipkin-u, uključujući i skok kroz broker.</w:t>
       </w:r>
     </w:p>
     <w:p>
@@ -879,7 +934,7 @@
         <w:rPr>
           <w:color w:val="1F3B73"/>
         </w:rPr>
-        <w:t>2. Tehnologije i obrazlozenje izbora</w:t>
+        <w:t>2. Tehnologije i obrazloženje izbora</w:t>
       </w:r>
     </w:p>
     <w:tbl>
@@ -938,7 +993,7 @@
                 <w:b/>
                 <w:sz w:val="19"/>
               </w:rPr>
-              <w:t>Zasto</w:t>
+              <w:t>Zašto</w:t>
             </w:r>
           </w:p>
         </w:tc>
@@ -1114,7 +1169,7 @@
               <w:rPr>
                 <w:sz w:val="19"/>
               </w:rPr>
-              <w:t>Topic exchange omogucava dodavanje konzumera bez izmene producera</w:t>
+              <w:t>Topic exchange omogućava dodavanje konzumera bez izmene producera</w:t>
             </w:r>
           </w:p>
         </w:tc>
@@ -1350,7 +1405,7 @@
               <w:rPr>
                 <w:sz w:val="19"/>
               </w:rPr>
-              <w:t>Staticka analiza</w:t>
+              <w:t>Statička analiza</w:t>
             </w:r>
           </w:p>
         </w:tc>
@@ -1444,7 +1499,7 @@
         <w:rPr>
           <w:sz w:val="21"/>
         </w:rPr>
-        <w:t>Specifikacija ga eksplicitno oznacava kao opcioni, u kombinaciji sa REST-om. Sva cetiri obavezna tipa komunikacije su pokrivena.</w:t>
+        <w:t>Specifikacija ga eksplicitno označava kao opcioni, u kombinaciji sa REST-om. Sva četiri obavezna tipa komunikacije su pokrivena.</w:t>
       </w:r>
     </w:p>
     <w:p>
@@ -1460,7 +1515,7 @@
         <w:rPr>
           <w:color w:val="1F3B73"/>
         </w:rPr>
-        <w:t>3. Ispunjenost zahteva po tackama specifikacije</w:t>
+        <w:t>3. Ispunjenost zahteva po tačkama specifikacije</w:t>
       </w:r>
     </w:p>
     <w:p>
@@ -1471,7 +1526,7 @@
         <w:rPr>
           <w:color w:val="1F3B73"/>
         </w:rPr>
-        <w:t>Tacka 1 - Opsti zahtevi pocetne aplikacije</w:t>
+        <w:t>Tačka 1 - Opšti zahtevi početne aplikacije</w:t>
       </w:r>
     </w:p>
     <w:p>
@@ -1482,7 +1537,7 @@
         <w:rPr>
           <w:sz w:val="21"/>
         </w:rPr>
-        <w:t xml:space="preserve">Pet mikroservisa, uz zahtevani minimum od cetiri: </w:t>
+        <w:t xml:space="preserve">Pet mikroservisa, uz zahtevani minimum od četiri: </w:t>
       </w:r>
       <w:r>
         <w:rPr>
@@ -1684,7 +1739,7 @@
         <w:rPr>
           <w:sz w:val="21"/>
         </w:rPr>
-        <w:t xml:space="preserve">Logovi, metrike i trace-ovi se salju iz svih pet servisa: metrike na Prometheus preko </w:t>
+        <w:t xml:space="preserve">Logovi, metrike i trace-ovi se šalju iz svih pet servisa: metrike na Prometheus preko </w:t>
       </w:r>
       <w:r>
         <w:rPr>
@@ -1734,7 +1789,7 @@
         <w:rPr>
           <w:sz w:val="21"/>
         </w:rPr>
-        <w:t>Tipovi komunikacije, sva cetiri obavezna:</w:t>
+        <w:t>Tipovi komunikacije, sva četiri obavezna:</w:t>
       </w:r>
     </w:p>
     <w:tbl>
@@ -2101,7 +2156,7 @@
         <w:rPr>
           <w:sz w:val="21"/>
         </w:rPr>
-        <w:t>Objavljivanje dogadjaja na RabbitMQ:</w:t>
+        <w:t>Objavljivanje događaja na RabbitMQ:</w:t>
       </w:r>
     </w:p>
     <w:p>
@@ -2165,7 +2220,7 @@
         <w:rPr>
           <w:sz w:val="21"/>
         </w:rPr>
-        <w:t>Konzumiranje dogadjaja u drugom servisu:</w:t>
+        <w:t>Konzumiranje događaja u drugom servisu:</w:t>
       </w:r>
     </w:p>
     <w:p>
@@ -2293,7 +2348,7 @@
         <w:rPr>
           <w:color w:val="1F3B73"/>
         </w:rPr>
-        <w:t>Tacka 2 - Git workflow i verzionisanje</w:t>
+        <w:t>Tačka 2 - Git workflow i verzionisanje</w:t>
       </w:r>
     </w:p>
     <w:p>
@@ -2304,7 +2359,7 @@
         <w:rPr>
           <w:sz w:val="21"/>
         </w:rPr>
-        <w:t xml:space="preserve">Rad je isao iskljucivo kroz feature grane, uz obavezan pull request za svaku celinu. Direktnog push-a na </w:t>
+        <w:t xml:space="preserve">Rad je išao isključivo kroz feature grane, uz obavezan pull request za svaku celinu. Direktnog push-a na </w:t>
       </w:r>
       <w:r>
         <w:rPr>
@@ -2380,7 +2435,7 @@
         <w:rPr>
           <w:color w:val="1F3B73"/>
         </w:rPr>
-        <w:t>Tacka 3 - Testiranje</w:t>
+        <w:t>Tačka 3 - Testiranje</w:t>
       </w:r>
     </w:p>
     <w:p>
@@ -2466,7 +2521,7 @@
               <w:rPr>
                 <w:sz w:val="19"/>
               </w:rPr>
-              <w:t>Jedinicni i integracioni</w:t>
+              <w:t>Jedinični i integracioni</w:t>
             </w:r>
           </w:p>
         </w:tc>
@@ -2553,7 +2608,7 @@
         <w:rPr>
           <w:sz w:val="21"/>
         </w:rPr>
-        <w:t>Jedinicni testovi koriste ugradjenu H2 bazu, pa CI ne mora da dize PostgreSQL. End-to-end testovi rade nad stvarno podignutim sistemom, kroz gateway.</w:t>
+        <w:t>Jedinični testovi koriste ugrađenu H2 bazu, pa CI ne mora da diže PostgreSQL. End-to-end testovi rade nad stvarno podignutim sistemom, kroz gateway.</w:t>
       </w:r>
     </w:p>
     <w:p>
@@ -2588,7 +2643,7 @@
         <w:rPr>
           <w:sz w:val="21"/>
         </w:rPr>
-        <w:t>End-to-end provera celog lanca, sa cekanjem na asinhronu notifikaciju:</w:t>
+        <w:t>End-to-end provera celog lanca, sa čekanjem na asinhronu notifikaciju:</w:t>
       </w:r>
     </w:p>
     <w:p>
@@ -2652,7 +2707,7 @@
         <w:rPr>
           <w:color w:val="1F3B73"/>
         </w:rPr>
-        <w:t>Tacka 4 - CI pipeline</w:t>
+        <w:t>Tačka 4 - CI pipeline</w:t>
       </w:r>
     </w:p>
     <w:p>
@@ -2663,7 +2718,7 @@
         <w:rPr>
           <w:sz w:val="21"/>
         </w:rPr>
-        <w:t>CI se pokrece automatski na svaki push i svaki pull request. Obuhvata build svih pet servisa kroz jedan aggregator POM, izvrsavanje svih testova, SonarCloud analizu sa JaCoCo izvestajem o pokrivenosti, upload build artefakata, Docker build svih pet image-a paralelno kroz matrix strategiju, i end-to-end testove nad podignutim sistemom.</w:t>
+        <w:t>CI se pokreće automatski na svaki push i svaki pull request. Obuhvata build svih pet servisa kroz jedan aggregator POM, izvršavanje svih testova, SonarCloud analizu sa JaCoCo izveštajem o pokrivenosti, upload build artefakata, Docker build svih pet image-a paralelno kroz matrix strategiju, i end-to-end testove nad podignutim sistemom.</w:t>
       </w:r>
     </w:p>
     <w:p>
@@ -2716,7 +2771,7 @@
           <w:color w:val="555A64"/>
           <w:sz w:val="17"/>
         </w:rPr>
-        <w:t>.github/workflows/ci.yml, kljucni koraci</w:t>
+        <w:t>.github/workflows/ci.yml, ključni koraci</w:t>
       </w:r>
     </w:p>
     <w:p>
@@ -2727,7 +2782,7 @@
         <w:rPr>
           <w:color w:val="1F3B73"/>
         </w:rPr>
-        <w:t>Tacka 5 - Docker kontejnerizacija</w:t>
+        <w:t>Tačka 5 - Docker kontejnerizacija</w:t>
       </w:r>
     </w:p>
     <w:p>
@@ -2751,7 +2806,7 @@
         <w:rPr>
           <w:sz w:val="21"/>
         </w:rPr>
-        <w:t>-om. Build je multi-stage: build faza koristi Maven image, runtime faza samo JRE, pa finalni image ne sadrzi Maven ni izvorni kod.</w:t>
+        <w:t>-om. Build je multi-stage: build faza koristi Maven image, runtime faza samo JRE, pa finalni image ne sadrži Maven ni izvorni kod.</w:t>
       </w:r>
     </w:p>
     <w:p>
@@ -2827,7 +2882,7 @@
         <w:rPr>
           <w:sz w:val="21"/>
         </w:rPr>
-        <w:t xml:space="preserve"> postoji u svakom od pet servisa i iskljucuje nepotrebno iz build konteksta:</w:t>
+        <w:t xml:space="preserve"> postoji u svakom od pet servisa i isključuje nepotrebno iz build konteksta:</w:t>
       </w:r>
     </w:p>
     <w:tbl>
@@ -2981,7 +3036,7 @@
         <w:rPr>
           <w:sz w:val="21"/>
         </w:rPr>
-        <w:t xml:space="preserve"> i sa SHA commit-a. Docker build je integrisan u CI i pokrece se automatski na svaki push.</w:t>
+        <w:t xml:space="preserve"> i sa SHA commit-a. Docker build je integrisan u CI i pokreće se automatski na svaki push.</w:t>
       </w:r>
     </w:p>
     <w:p>
@@ -2992,7 +3047,7 @@
         <w:rPr>
           <w:color w:val="1F3B73"/>
         </w:rPr>
-        <w:t>Tacka 6 - Docker Compose orkestracija</w:t>
+        <w:t>Tačka 6 - Docker Compose orkestracija</w:t>
       </w:r>
     </w:p>
     <w:p>
@@ -3003,7 +3058,7 @@
         <w:rPr>
           <w:sz w:val="21"/>
         </w:rPr>
-        <w:t xml:space="preserve">Ceo sistem se podize jednom komandom. </w:t>
+        <w:t xml:space="preserve">Ceo sistem se podiže jednom komandom. </w:t>
       </w:r>
       <w:r>
         <w:rPr>
@@ -3016,7 +3071,7 @@
         <w:rPr>
           <w:sz w:val="21"/>
         </w:rPr>
-        <w:t xml:space="preserve"> sadrzi jedanaest kontejnera: pet servisa, PostgreSQL, RabbitMQ, Prometheus, Grafana, Loki i Zipkin.</w:t>
+        <w:t xml:space="preserve"> sadrži jedanaest kontejnera: pet servisa, PostgreSQL, RabbitMQ, Prometheus, Grafana, Loki i Zipkin.</w:t>
       </w:r>
     </w:p>
     <w:p>
@@ -3028,7 +3083,7 @@
         <w:rPr>
           <w:sz w:val="21"/>
         </w:rPr>
-        <w:t xml:space="preserve">Mreza: svi kontejneri su na zajednickoj </w:t>
+        <w:t xml:space="preserve">Mreža: svi kontejneri su na zajedničkoj </w:t>
       </w:r>
       <w:r>
         <w:rPr>
@@ -3041,7 +3096,7 @@
         <w:rPr>
           <w:sz w:val="21"/>
         </w:rPr>
-        <w:t xml:space="preserve"> bridge mrezi i adresiraju se po imenu servisa.</w:t>
+        <w:t xml:space="preserve"> bridge mreži i adresiraju se po imenu servisa.</w:t>
       </w:r>
     </w:p>
     <w:p>
@@ -3079,7 +3134,7 @@
         <w:rPr>
           <w:sz w:val="21"/>
         </w:rPr>
-        <w:t xml:space="preserve"> commit-ovan kao sablon.</w:t>
+        <w:t xml:space="preserve"> commit-ovan kao šablon.</w:t>
       </w:r>
     </w:p>
     <w:p>
@@ -3192,7 +3247,7 @@
         <w:rPr>
           <w:sz w:val="21"/>
         </w:rPr>
-        <w:t>Primer definicije jednog servisa, sa healthcheck-om i cekanjem na zdrave zavisnosti:</w:t>
+        <w:t>Primer definicije jednog servisa, sa healthcheck-om i čekanjem na zdrave zavisnosti:</w:t>
       </w:r>
     </w:p>
     <w:p>
@@ -3245,7 +3300,7 @@
           <w:color w:val="555A64"/>
           <w:sz w:val="17"/>
         </w:rPr>
-        <w:t>docker-compose.yml, isecak</w:t>
+        <w:t>docker-compose.yml, isečak</w:t>
       </w:r>
     </w:p>
     <w:p>
@@ -3256,7 +3311,7 @@
         <w:rPr>
           <w:color w:val="1F3B73"/>
         </w:rPr>
-        <w:t>Tacka 7 - Staticka analiza koda</w:t>
+        <w:t>Tačka 7 - Statička analiza koda</w:t>
       </w:r>
     </w:p>
     <w:p>
@@ -3267,7 +3322,7 @@
         <w:rPr>
           <w:sz w:val="21"/>
         </w:rPr>
-        <w:t>SonarCloud je integrisan u CI pipeline i pokrece se nad svih pet modula kroz jedan scan nad aggregator POM-om. JaCoCo generise izvestaj o pokrivenosti koji se prosledjuje Sonar-u.</w:t>
+        <w:t>SonarCloud je integrisan u CI pipeline i pokreće se nad svih pet modula kroz jedan scan nad aggregator POM-om. JaCoCo generiše izveštaj o pokrivenosti koji se prosleđuje Sonar-u.</w:t>
       </w:r>
     </w:p>
     <w:p>
@@ -3278,7 +3333,7 @@
         <w:rPr>
           <w:sz w:val="21"/>
         </w:rPr>
-        <w:t>Analiza pokriva code smells, potencijalne bugove i sigurnosne probleme. Quality gate obara build ako nije zadovoljen. Taj flag je namerno ukljucen tek kada je kod bio cist, da ne bi blokirao rad tokom razvoja.</w:t>
+        <w:t>Analiza pokriva code smells, potencijalne bugove i sigurnosne probleme. Quality gate obara build ako nije zadovoljen. Taj flag je namerno uključen tek kada je kod bio čist, da ne bi blokirao rad tokom razvoja.</w:t>
       </w:r>
     </w:p>
     <w:p>
@@ -3331,7 +3386,7 @@
           <w:color w:val="555A64"/>
           <w:sz w:val="17"/>
         </w:rPr>
-        <w:t>.github/workflows/ci.yml, korak staticke analize</w:t>
+        <w:t>.github/workflows/ci.yml, korak statičke analize</w:t>
       </w:r>
     </w:p>
     <w:p>
@@ -3342,7 +3397,7 @@
         <w:rPr>
           <w:sz w:val="21"/>
         </w:rPr>
-        <w:t xml:space="preserve">Analiza se pokrece na pull request-ovima i na </w:t>
+        <w:t xml:space="preserve">Analiza se pokreće na pull request-ovima i na </w:t>
       </w:r>
       <w:r>
         <w:rPr>
@@ -3355,7 +3410,7 @@
         <w:rPr>
           <w:sz w:val="21"/>
         </w:rPr>
-        <w:t xml:space="preserve"> grani. Nije ukljucena na push proizvoljne feature grane, jer SonarCloud za taj slucaj ne autorizuje citanje statusa quality gate-a.</w:t>
+        <w:t xml:space="preserve"> grani. Nije uključena na push proizvoljne feature grane, jer SonarCloud za taj slučaj ne autorizuje čitanje statusa quality gate-a.</w:t>
       </w:r>
     </w:p>
     <w:p>
@@ -3366,7 +3421,7 @@
         <w:rPr>
           <w:color w:val="1F3B73"/>
         </w:rPr>
-        <w:t>Tacka 8 - Deployment</w:t>
+        <w:t>Tačka 8 - Deployment</w:t>
       </w:r>
     </w:p>
     <w:p>
@@ -3377,7 +3432,7 @@
         <w:rPr>
           <w:sz w:val="21"/>
         </w:rPr>
-        <w:t>Deploy je realizovan u potpunosti lokalno, u kontejnerizovanom okruzenju, sto specifikacija izricito dozvoljava.</w:t>
+        <w:t>Deploy je realizovan u potpunosti lokalno, u kontejnerizovanom okruženju, sto specifikacija izričito dozvoljava.</w:t>
       </w:r>
     </w:p>
     <w:p>
@@ -3401,7 +3456,7 @@
         <w:rPr>
           <w:sz w:val="21"/>
         </w:rPr>
-        <w:t xml:space="preserve"> podize Docker aplikaciju sa bazom, ceka da svaki kontejner prijavi </w:t>
+        <w:t xml:space="preserve"> podiže Docker aplikaciju sa bazom, čeka da svaki kontejner prijavi </w:t>
       </w:r>
       <w:r>
         <w:rPr>
@@ -3414,7 +3469,7 @@
         <w:rPr>
           <w:sz w:val="21"/>
         </w:rPr>
-        <w:t>, zatim proverava health endpoint svakog od pet servisa i rutiranje kroz gateway. Provere imaju retry mehanizam, jer mapiranje portova ume da zakasni za kontejnerom. Skripta vraca neuspeh ako bilo koja provera ne prodje.</w:t>
+        <w:t>, zatim proverava health endpoint svakog od pet servisa i rutiranje kroz gateway. Provere imaju retry mehanizam, jer mapiranje portova ume da zakasni za kontejnerom. Skripta vraća neuspeh ako bilo koja provera ne prođe.</w:t>
       </w:r>
     </w:p>
     <w:p>
@@ -3478,7 +3533,7 @@
         <w:rPr>
           <w:color w:val="1F3B73"/>
         </w:rPr>
-        <w:t>Tacka 9 - CD pipeline</w:t>
+        <w:t>Tačka 9 - CD pipeline</w:t>
       </w:r>
     </w:p>
     <w:p>
@@ -3489,7 +3544,7 @@
         <w:rPr>
           <w:sz w:val="21"/>
         </w:rPr>
-        <w:t xml:space="preserve">CD je poseban workflow koji se pokrece automatski kada se pull request merge-uje u </w:t>
+        <w:t xml:space="preserve">CD je poseban workflow koji se pokreće automatski kada se pull request merge-uje u </w:t>
       </w:r>
       <w:r>
         <w:rPr>
@@ -3579,7 +3634,7 @@
         <w:rPr>
           <w:sz w:val="21"/>
         </w:rPr>
-        <w:t xml:space="preserve">Drugi posao je post-deploy provera: povlaci upravo objavljene image-e po SHA tagu, podize ceo sistem u runner-u i proverava da svih pet servisa vraca </w:t>
+        <w:t xml:space="preserve">Drugi posao je post-deploy provera: povlači upravo objavljene image-e po SHA tagu, podiže ceo sistem u runner-u i proverava da svih pet servisa vraća </w:t>
       </w:r>
       <w:r>
         <w:rPr>
@@ -3592,7 +3647,7 @@
         <w:rPr>
           <w:sz w:val="21"/>
         </w:rPr>
-        <w:t xml:space="preserve"> na health endpointu, zatim kroz gateway kreira zaposlenog i zadatak, proverava da zadatak za nepostojeceg zaposlenog vraca </w:t>
+        <w:t xml:space="preserve"> na health endpointu, zatim kroz gateway kreira zaposlenog i zadatak, proverava da zadatak za nepostojećeg zaposlenog vraća </w:t>
       </w:r>
       <w:r>
         <w:rPr>
@@ -3605,7 +3660,7 @@
         <w:rPr>
           <w:sz w:val="21"/>
         </w:rPr>
-        <w:t>, i ceka da se notifikacija pojavi iz reda poruka.</w:t>
+        <w:t>, i čeka da se notifikacija pojavi iz reda poruka.</w:t>
       </w:r>
     </w:p>
     <w:p>
@@ -3616,7 +3671,7 @@
         <w:rPr>
           <w:color w:val="1F3B73"/>
         </w:rPr>
-        <w:t>Tacka 10 - Monitoring i observability</w:t>
+        <w:t>Tačka 10 - Monitoring i observability</w:t>
       </w:r>
     </w:p>
     <w:p>
@@ -3627,7 +3682,7 @@
         <w:rPr>
           <w:sz w:val="21"/>
         </w:rPr>
-        <w:t xml:space="preserve">Monitoring je potpuno lokalni, zasnovan na kombinaciji Prometheus i Grafana, uz Loki za logove i Zipkin za trace-ove. Grafana se dize sa automatski provizioniranim datasource-ima i dashboardom, pa se nista ne podesava rucno i konfiguracija prezivljava </w:t>
+        <w:t xml:space="preserve">Monitoring je potpuno lokalni, zasnovan na kombinaciji Prometheus i Grafana, uz Loki za logove i Zipkin za trace-ove. Grafana se diže sa automatski provizioniranim datasource-ima i dashboardom, pa se ništa ne podešava ručno i konfiguracija preživljava </w:t>
       </w:r>
       <w:r>
         <w:rPr>
@@ -3664,7 +3719,7 @@
         <w:rPr>
           <w:sz w:val="21"/>
         </w:rPr>
-        <w:t xml:space="preserve"> prati sve tri trazene metrike, po servisu:</w:t>
+        <w:t xml:space="preserve"> prati sve tri tražene metrike, po servisu:</w:t>
       </w:r>
     </w:p>
     <w:tbl>
@@ -3796,7 +3851,7 @@
               <w:rPr>
                 <w:sz w:val="19"/>
               </w:rPr>
-              <w:t>udeo 5xx odgovora u ukupnom saobracaju, sa vracanjem na nulu kada gresaka nema</w:t>
+              <w:t>udeo 5xx odgovora u ukupnom saobraćaju, sa vraćanjem na nulu kada grešaka nema</w:t>
             </w:r>
           </w:p>
         </w:tc>
@@ -3811,7 +3866,7 @@
         <w:rPr>
           <w:sz w:val="21"/>
         </w:rPr>
-        <w:t xml:space="preserve">Da bi Latency panel imao podatke, u svim servisima su ukljuceni histogram bucket-i. Bez toga Micrometer objavljuje samo zbir i broj zahteva, pa upit nad </w:t>
+        <w:t xml:space="preserve">Da bi Latency panel imao podatke, u svim servisima su uključeni histogram bucket-i. Bez toga Micrometer objavljuje samo zbir i broj zahteva, pa upit nad </w:t>
       </w:r>
       <w:r>
         <w:rPr>
@@ -3824,7 +3879,7 @@
         <w:rPr>
           <w:sz w:val="21"/>
         </w:rPr>
-        <w:t xml:space="preserve"> serijom ne bi vracao nista.</w:t>
+        <w:t xml:space="preserve"> serijom ne bi vraćao ništa.</w:t>
       </w:r>
     </w:p>
     <w:p>
@@ -3916,7 +3971,7 @@
           <w:color w:val="555A64"/>
           <w:sz w:val="17"/>
         </w:rPr>
-        <w:t>Grafana dashboard sa tri trazene metrike</w:t>
+        <w:t>Grafana dashboard sa tri tražene metrike</w:t>
       </w:r>
     </w:p>
     <w:p>
@@ -5051,7 +5106,7 @@
               <w:rPr>
                 <w:sz w:val="19"/>
               </w:rPr>
-              <w:t>Compose, mreza, volume-i</w:t>
+              <w:t>Compose, mreža, volume-i</w:t>
             </w:r>
           </w:p>
         </w:tc>
@@ -5162,7 +5217,7 @@
               <w:rPr>
                 <w:sz w:val="19"/>
               </w:rPr>
-              <w:t>Staticka analiza</w:t>
+              <w:t>Statička analiza</w:t>
             </w:r>
           </w:p>
         </w:tc>
@@ -5443,7 +5498,7 @@
         <w:rPr>
           <w:sz w:val="21"/>
         </w:rPr>
-        <w:t xml:space="preserve"> iskljucivo kroz pull request. </w:t>
+        <w:t xml:space="preserve"> isključivo kroz pull request. </w:t>
       </w:r>
       <w:r>
         <w:rPr>
@@ -5456,7 +5511,7 @@
         <w:rPr>
           <w:sz w:val="21"/>
         </w:rPr>
-        <w:t xml:space="preserve"> u svakom trenutku sadrzi stabilan kod, sa zelenim CI-jem.</w:t>
+        <w:t xml:space="preserve"> u svakom trenutku sadrži stabilan kod, sa zelenim CI-jem.</w:t>
       </w:r>
     </w:p>
     <w:tbl>
@@ -6731,7 +6786,7 @@
           <w:color w:val="555A64"/>
           <w:sz w:val="17"/>
         </w:rPr>
-        <w:t>SonarCloud rezultat sa pokrivenoscu koda</w:t>
+        <w:t>SonarCloud rezultat sa pokrivenošću koda</w:t>
       </w:r>
     </w:p>
     <w:p>
@@ -6838,7 +6893,7 @@
         <w:rPr>
           <w:sz w:val="21"/>
         </w:rPr>
-        <w:t xml:space="preserve">Skripta builda sve image-e, podize jedanaest kontejnera, ceka da svaki prijavi </w:t>
+        <w:t xml:space="preserve">Skripta builda sve image-e, podiže jedanaest kontejnera, čeka da svaki prijavi </w:t>
       </w:r>
       <w:r>
         <w:rPr>
@@ -6875,7 +6930,7 @@
         <w:rPr>
           <w:sz w:val="21"/>
         </w:rPr>
-        <w:t xml:space="preserve">, ukljuciti podrsku za duge putanje jednom komandom </w:t>
+        <w:t xml:space="preserve">, uključiti podršku za duge putanje jednom komandom </w:t>
       </w:r>
       <w:r>
         <w:rPr>
@@ -7039,7 +7094,7 @@
         <w:rPr>
           <w:sz w:val="21"/>
         </w:rPr>
-        <w:t>Poslednji poziv vraca notifikaciju koja je nastala automatski, preko RabbitMQ-a.</w:t>
+        <w:t>Poslednji poziv vraća notifikaciju koja je nastala automatski, preko RabbitMQ-a.</w:t>
       </w:r>
     </w:p>
     <w:tbl>
@@ -7246,7 +7301,7 @@
         <w:rPr>
           <w:sz w:val="21"/>
         </w:rPr>
-        <w:t xml:space="preserve">Gasenje sistema, uz brisanje podataka: </w:t>
+        <w:t xml:space="preserve">Gašenje sistema, uz brisanje podataka: </w:t>
       </w:r>
       <w:r>
         <w:rPr>
@@ -7285,7 +7340,7 @@
         <w:rPr>
           <w:color w:val="1F3B73"/>
         </w:rPr>
-        <w:t>Trace kroz cetiri servisa</w:t>
+        <w:t>Trace kroz četiri servisa</w:t>
       </w:r>
     </w:p>
     <w:p>
@@ -7309,7 +7364,7 @@
         <w:rPr>
           <w:sz w:val="21"/>
         </w:rPr>
-        <w:t xml:space="preserve"> daje u Zipkin-u trace od sedam spanova, ukljucujuci i asinhroni skok kroz RabbitMQ:</w:t>
+        <w:t xml:space="preserve"> daje u Zipkin-u trace od sedam spanova, uključujući i asinhroni skok kroz RabbitMQ:</w:t>
       </w:r>
     </w:p>
     <w:tbl>
@@ -7602,7 +7657,7 @@
         <w:rPr>
           <w:sz w:val="21"/>
         </w:rPr>
-        <w:t xml:space="preserve"> job-a, nad image-ima povucenim sa registry-ja po SHA tagu:</w:t>
+        <w:t xml:space="preserve"> job-a, nad image-ima povučenim sa registry-ja po SHA tagu:</w:t>
       </w:r>
     </w:p>
     <w:tbl>
@@ -7739,7 +7794,7 @@
                 <w:rFonts w:ascii="Consolas" w:hAnsi="Consolas" w:eastAsia="Consolas"/>
                 <w:sz w:val="17"/>
               </w:rPr>
-              <w:t>POST /api/tasks sa nepostojecim zaposlenim   -&gt; 404</w:t>
+              <w:t>POST /api/tasks sa nepostojećim zaposlenim   -&gt; 404</w:t>
             </w:r>
           </w:p>
           <w:p>
@@ -7766,7 +7821,7 @@
         <w:rPr>
           <w:color w:val="1F3B73"/>
         </w:rPr>
-        <w:t>Verifikacija iz cistog klona</w:t>
+        <w:t>Verifikacija iz čistog klona</w:t>
       </w:r>
     </w:p>
     <w:p>
@@ -7777,7 +7832,7 @@
         <w:rPr>
           <w:sz w:val="21"/>
         </w:rPr>
-        <w:t>Sistem je proveren iz svezeg klona repozitorijuma, na praznim volume-ima, sto je jedini nacin da se potvrdi da init skripta stvarno kreira cetiri baze:</w:t>
+        <w:t>Sistem je proveren iz svežeg klona repozitorijuma, na praznim volume-ima, sto je jedini način da se potvrdi da init skripta stvarno kreira četiri baze:</w:t>
       </w:r>
     </w:p>
     <w:tbl>
@@ -7806,7 +7861,7 @@
                 <w:rFonts w:ascii="Consolas" w:hAnsi="Consolas" w:eastAsia="Consolas"/>
                 <w:sz w:val="17"/>
               </w:rPr>
-              <w:t>svez git clone -&gt; cp .env.example .env -&gt; ./deploy.sh</w:t>
+              <w:t>svež git clone -&gt; cp .env.example .env -&gt; ./deploy.sh</w:t>
             </w:r>
           </w:p>
           <w:p>
@@ -8099,6 +8154,7 @@
       </w:r>
     </w:p>
     <w:sectPr>
+      <w:footerReference w:type="default" r:id="rId27"/>
       <w:pgSz w:w="12240" w:h="15840"/>
       <w:pgMar w:top="1440" w:right="1800" w:bottom="1440" w:left="1800" w:header="720" w:footer="720" w:gutter="0"/>
       <w:cols w:space="720"/>
@@ -8106,6 +8162,51 @@
     </w:sectPr>
   </w:body>
 </w:document>
+</file>
+
+<file path=word/footer1.xml><?xml version="1.0" encoding="utf-8"?>
+<w:ftr xmlns:r="http://schemas.openxmlformats.org/officeDocument/2006/relationships" xmlns:w="http://schemas.openxmlformats.org/wordprocessingml/2006/main">
+  <w:p>
+    <w:pPr>
+      <w:jc w:val="center"/>
+    </w:pPr>
+    <w:r>
+      <w:rPr>
+        <w:color w:val="808080"/>
+        <w:sz w:val="18"/>
+      </w:rPr>
+      <w:fldChar w:fldCharType="begin"/>
+    </w:r>
+    <w:r>
+      <w:rPr>
+        <w:color w:val="808080"/>
+        <w:sz w:val="18"/>
+      </w:rPr>
+      <w:instrText xml:space="preserve"> PAGE </w:instrText>
+    </w:r>
+    <w:r>
+      <w:rPr>
+        <w:color w:val="808080"/>
+        <w:sz w:val="18"/>
+      </w:rPr>
+      <w:fldChar w:fldCharType="separate"/>
+    </w:r>
+    <w:r>
+      <w:rPr>
+        <w:color w:val="808080"/>
+        <w:sz w:val="18"/>
+      </w:rPr>
+      <w:t>1</w:t>
+    </w:r>
+    <w:r>
+      <w:rPr>
+        <w:color w:val="808080"/>
+        <w:sz w:val="18"/>
+      </w:rPr>
+      <w:fldChar w:fldCharType="end"/>
+    </w:r>
+  </w:p>
+</w:ftr>
 </file>
 
 <file path=word/numbering.xml><?xml version="1.0" encoding="utf-8"?>

</xml_diff>